<commit_message>
WO-REF01-060-B16-FIELD-COMPLETENESS-001: 기존 서식 9종 필드 완전성 교정
FIELD_COMPLETENESS_HOLD 9종(CHW-03, EQUIP-01~05, P-01, ENV-04, P-10)
필수 입력란 추가 교정. 교정 전 출력물 18건 격리 보관, 18건 재빌드.
385/385 PASS. 기타 출력 274건 SHA 불변.

WO: WO-REF01-060-B16-FIELD-COMPLETENESS-001
BASE: 1813332e66222b286fc20105a33313c532154320
TARGET: 9 forms
JSON_CORRECTED: 9
PDF_REBUILT: 9
DOCX_REBUILT: 9
ARCHIVED: 18
PYTEST: 385/385 PASS
DB: 0
</commit_message>
<xml_diff>
--- a/docs/reference-forms/output/TAI-FORM-CHW-03-blank.docx
+++ b/docs/reference-forms/output/TAI-FORM-CHW-03-blank.docx
@@ -215,7 +215,7 @@
                 <w:sz w:val="20"/>
                 <w:szCs w:val="20"/>
               </w:rPr>
-              <w:t xml:space="preserve"/>
+              <w:t xml:space="preserve">보관구역: </w:t>
             </w:r>
           </w:p>
         </w:tc>
@@ -243,15 +243,17 @@
         <w:tblLayout w:type="fixed"/>
       </w:tblPr>
       <w:tblGrid>
-        <w:gridCol w:w="2154"/>
-        <w:gridCol w:w="1587"/>
-        <w:gridCol w:w="907"/>
+        <w:gridCol w:w="1700"/>
+        <w:gridCol w:w="1133"/>
         <w:gridCol w:w="1360"/>
-        <w:gridCol w:w="1360"/>
-        <w:gridCol w:w="1360"/>
-        <w:gridCol w:w="2267"/>
-        <w:gridCol w:w="2267"/>
-        <w:gridCol w:w="1303"/>
+        <w:gridCol w:w="1247"/>
+        <w:gridCol w:w="793"/>
+        <w:gridCol w:w="1247"/>
+        <w:gridCol w:w="1247"/>
+        <w:gridCol w:w="1133"/>
+        <w:gridCol w:w="1814"/>
+        <w:gridCol w:w="1814"/>
+        <w:gridCol w:w="1077"/>
       </w:tblGrid>
       <w:tr>
         <w:trPr>
@@ -260,7 +262,7 @@
         </w:trPr>
         <w:tc>
           <w:tcPr>
-            <w:tcW w:type="dxa" w:w="2154"/>
+            <w:tcW w:type="dxa" w:w="1700"/>
             <w:tcBorders>
               <w:top w:val="single" w:color="000000" w:sz="4"/>
               <w:left w:val="single" w:color="000000" w:sz="4"/>
@@ -294,7 +296,7 @@
         </w:tc>
         <w:tc>
           <w:tcPr>
-            <w:tcW w:type="dxa" w:w="1587"/>
+            <w:tcW w:type="dxa" w:w="1133"/>
             <w:tcBorders>
               <w:top w:val="single" w:color="000000" w:sz="4"/>
               <w:left w:val="single" w:color="000000" w:sz="4"/>
@@ -322,13 +324,13 @@
                 <w:sz w:val="20"/>
                 <w:szCs w:val="20"/>
               </w:rPr>
-              <w:t xml:space="preserve">CAS번호</w:t>
-            </w:r>
-          </w:p>
-        </w:tc>
-        <w:tc>
-          <w:tcPr>
-            <w:tcW w:type="dxa" w:w="907"/>
+              <w:t xml:space="preserve">로트번호</w:t>
+            </w:r>
+          </w:p>
+        </w:tc>
+        <w:tc>
+          <w:tcPr>
+            <w:tcW w:type="dxa" w:w="1360"/>
             <w:tcBorders>
               <w:top w:val="single" w:color="000000" w:sz="4"/>
               <w:left w:val="single" w:color="000000" w:sz="4"/>
@@ -356,13 +358,13 @@
                 <w:sz w:val="20"/>
                 <w:szCs w:val="20"/>
               </w:rPr>
-              <w:t xml:space="preserve">단위</w:t>
-            </w:r>
-          </w:p>
-        </w:tc>
-        <w:tc>
-          <w:tcPr>
-            <w:tcW w:type="dxa" w:w="1360"/>
+              <w:t xml:space="preserve">CAS번호</w:t>
+            </w:r>
+          </w:p>
+        </w:tc>
+        <w:tc>
+          <w:tcPr>
+            <w:tcW w:type="dxa" w:w="1247"/>
             <w:tcBorders>
               <w:top w:val="single" w:color="000000" w:sz="4"/>
               <w:left w:val="single" w:color="000000" w:sz="4"/>
@@ -390,13 +392,13 @@
                 <w:sz w:val="20"/>
                 <w:szCs w:val="20"/>
               </w:rPr>
-              <w:t xml:space="preserve">장부재고</w:t>
-            </w:r>
-          </w:p>
-        </w:tc>
-        <w:tc>
-          <w:tcPr>
-            <w:tcW w:type="dxa" w:w="1360"/>
+              <w:t xml:space="preserve">보관구역</w:t>
+            </w:r>
+          </w:p>
+        </w:tc>
+        <w:tc>
+          <w:tcPr>
+            <w:tcW w:type="dxa" w:w="793"/>
             <w:tcBorders>
               <w:top w:val="single" w:color="000000" w:sz="4"/>
               <w:left w:val="single" w:color="000000" w:sz="4"/>
@@ -424,13 +426,13 @@
                 <w:sz w:val="20"/>
                 <w:szCs w:val="20"/>
               </w:rPr>
-              <w:t xml:space="preserve">실사재고</w:t>
-            </w:r>
-          </w:p>
-        </w:tc>
-        <w:tc>
-          <w:tcPr>
-            <w:tcW w:type="dxa" w:w="1360"/>
+              <w:t xml:space="preserve">단위</w:t>
+            </w:r>
+          </w:p>
+        </w:tc>
+        <w:tc>
+          <w:tcPr>
+            <w:tcW w:type="dxa" w:w="1247"/>
             <w:tcBorders>
               <w:top w:val="single" w:color="000000" w:sz="4"/>
               <w:left w:val="single" w:color="000000" w:sz="4"/>
@@ -458,13 +460,13 @@
                 <w:sz w:val="20"/>
                 <w:szCs w:val="20"/>
               </w:rPr>
-              <w:t xml:space="preserve">차이수량</w:t>
-            </w:r>
-          </w:p>
-        </w:tc>
-        <w:tc>
-          <w:tcPr>
-            <w:tcW w:type="dxa" w:w="2267"/>
+              <w:t xml:space="preserve">장부재고</w:t>
+            </w:r>
+          </w:p>
+        </w:tc>
+        <w:tc>
+          <w:tcPr>
+            <w:tcW w:type="dxa" w:w="1247"/>
             <w:tcBorders>
               <w:top w:val="single" w:color="000000" w:sz="4"/>
               <w:left w:val="single" w:color="000000" w:sz="4"/>
@@ -492,13 +494,13 @@
                 <w:sz w:val="20"/>
                 <w:szCs w:val="20"/>
               </w:rPr>
-              <w:t xml:space="preserve">차이원인</w:t>
-            </w:r>
-          </w:p>
-        </w:tc>
-        <w:tc>
-          <w:tcPr>
-            <w:tcW w:type="dxa" w:w="2267"/>
+              <w:t xml:space="preserve">실사재고</w:t>
+            </w:r>
+          </w:p>
+        </w:tc>
+        <w:tc>
+          <w:tcPr>
+            <w:tcW w:type="dxa" w:w="1133"/>
             <w:tcBorders>
               <w:top w:val="single" w:color="000000" w:sz="4"/>
               <w:left w:val="single" w:color="000000" w:sz="4"/>
@@ -526,13 +528,81 @@
                 <w:sz w:val="20"/>
                 <w:szCs w:val="20"/>
               </w:rPr>
+              <w:t xml:space="preserve">차이수량</w:t>
+            </w:r>
+          </w:p>
+        </w:tc>
+        <w:tc>
+          <w:tcPr>
+            <w:tcW w:type="dxa" w:w="1814"/>
+            <w:tcBorders>
+              <w:top w:val="single" w:color="000000" w:sz="4"/>
+              <w:left w:val="single" w:color="000000" w:sz="4"/>
+              <w:bottom w:val="single" w:color="000000" w:sz="4"/>
+              <w:right w:val="single" w:color="000000" w:sz="4"/>
+            </w:tcBorders>
+            <w:shd w:fill="E8E8E8" w:color="auto" w:val="clear"/>
+            <w:tcMar>
+              <w:top w:type="dxa" w:w="170"/>
+              <w:left w:type="dxa" w:w="170"/>
+              <w:bottom w:type="dxa" w:w="170"/>
+              <w:right w:type="dxa" w:w="170"/>
+            </w:tcMar>
+            <w:vAlign w:val="center"/>
+          </w:tcPr>
+          <w:p>
+            <w:pPr>
+              <w:jc w:val="center"/>
+            </w:pPr>
+            <w:r>
+              <w:rPr>
+                <w:rFonts w:ascii="NanumGothic" w:cs="NanumGothic" w:eastAsia="NanumGothic" w:hAnsi="NanumGothic"/>
+                <w:b/>
+                <w:bCs/>
+                <w:sz w:val="20"/>
+                <w:szCs w:val="20"/>
+              </w:rPr>
+              <w:t xml:space="preserve">차이원인</w:t>
+            </w:r>
+          </w:p>
+        </w:tc>
+        <w:tc>
+          <w:tcPr>
+            <w:tcW w:type="dxa" w:w="1814"/>
+            <w:tcBorders>
+              <w:top w:val="single" w:color="000000" w:sz="4"/>
+              <w:left w:val="single" w:color="000000" w:sz="4"/>
+              <w:bottom w:val="single" w:color="000000" w:sz="4"/>
+              <w:right w:val="single" w:color="000000" w:sz="4"/>
+            </w:tcBorders>
+            <w:shd w:fill="E8E8E8" w:color="auto" w:val="clear"/>
+            <w:tcMar>
+              <w:top w:type="dxa" w:w="170"/>
+              <w:left w:type="dxa" w:w="170"/>
+              <w:bottom w:type="dxa" w:w="170"/>
+              <w:right w:type="dxa" w:w="170"/>
+            </w:tcMar>
+            <w:vAlign w:val="center"/>
+          </w:tcPr>
+          <w:p>
+            <w:pPr>
+              <w:jc w:val="center"/>
+            </w:pPr>
+            <w:r>
+              <w:rPr>
+                <w:rFonts w:ascii="NanumGothic" w:cs="NanumGothic" w:eastAsia="NanumGothic" w:hAnsi="NanumGothic"/>
+                <w:b/>
+                <w:bCs/>
+                <w:sz w:val="20"/>
+                <w:szCs w:val="20"/>
+              </w:rPr>
               <w:t xml:space="preserve">처리방법</w:t>
             </w:r>
           </w:p>
         </w:tc>
         <w:tc>
           <w:tcPr>
-            <w:tcW w:type="dxa" w:w="1303"/>
+            <w:tcW w:type="dxa" w:w="1077"/>
             <w:tcBorders>
               <w:top w:val="single" w:color="000000" w:sz="4"/>
               <w:left w:val="single" w:color="000000" w:sz="4"/>
@@ -571,71 +641,39 @@
         </w:trPr>
         <w:tc>
           <w:tcPr>
-            <w:tcW w:type="dxa" w:w="2154"/>
-            <w:tcBorders>
-              <w:top w:val="single" w:color="000000" w:sz="4"/>
-              <w:left w:val="single" w:color="000000" w:sz="4"/>
-              <w:bottom w:val="single" w:color="000000" w:sz="4"/>
-              <w:right w:val="single" w:color="000000" w:sz="4"/>
-            </w:tcBorders>
-            <w:shd w:fill="ffffff" w:color="auto" w:val="clear"/>
-            <w:tcMar>
-              <w:top w:type="dxa" w:w="170"/>
-              <w:left w:type="dxa" w:w="170"/>
-              <w:bottom w:type="dxa" w:w="170"/>
-              <w:right w:type="dxa" w:w="170"/>
-            </w:tcMar>
-            <w:vAlign w:val="center"/>
-          </w:tcPr>
-          <w:p>
-            <w:pPr>
-              <w:jc w:val="left"/>
-            </w:pPr>
-            <w:r>
-              <w:rPr>
-                <w:rFonts w:ascii="NanumGothic" w:cs="NanumGothic" w:eastAsia="NanumGothic" w:hAnsi="NanumGothic"/>
-                <w:sz w:val="20"/>
-                <w:szCs w:val="20"/>
-              </w:rPr>
-              <w:t xml:space="preserve"/>
-            </w:r>
-          </w:p>
-        </w:tc>
-        <w:tc>
-          <w:tcPr>
-            <w:tcW w:type="dxa" w:w="1587"/>
-            <w:tcBorders>
-              <w:top w:val="single" w:color="000000" w:sz="4"/>
-              <w:left w:val="single" w:color="000000" w:sz="4"/>
-              <w:bottom w:val="single" w:color="000000" w:sz="4"/>
-              <w:right w:val="single" w:color="000000" w:sz="4"/>
-            </w:tcBorders>
-            <w:shd w:fill="ffffff" w:color="auto" w:val="clear"/>
-            <w:tcMar>
-              <w:top w:type="dxa" w:w="170"/>
-              <w:left w:type="dxa" w:w="170"/>
-              <w:bottom w:type="dxa" w:w="170"/>
-              <w:right w:type="dxa" w:w="170"/>
-            </w:tcMar>
-            <w:vAlign w:val="center"/>
-          </w:tcPr>
-          <w:p>
-            <w:pPr>
-              <w:jc w:val="left"/>
-            </w:pPr>
-            <w:r>
-              <w:rPr>
-                <w:rFonts w:ascii="NanumGothic" w:cs="NanumGothic" w:eastAsia="NanumGothic" w:hAnsi="NanumGothic"/>
-                <w:sz w:val="20"/>
-                <w:szCs w:val="20"/>
-              </w:rPr>
-              <w:t xml:space="preserve"/>
-            </w:r>
-          </w:p>
-        </w:tc>
-        <w:tc>
-          <w:tcPr>
-            <w:tcW w:type="dxa" w:w="907"/>
+            <w:tcW w:type="dxa" w:w="1700"/>
+            <w:tcBorders>
+              <w:top w:val="single" w:color="000000" w:sz="4"/>
+              <w:left w:val="single" w:color="000000" w:sz="4"/>
+              <w:bottom w:val="single" w:color="000000" w:sz="4"/>
+              <w:right w:val="single" w:color="000000" w:sz="4"/>
+            </w:tcBorders>
+            <w:shd w:fill="ffffff" w:color="auto" w:val="clear"/>
+            <w:tcMar>
+              <w:top w:type="dxa" w:w="170"/>
+              <w:left w:type="dxa" w:w="170"/>
+              <w:bottom w:type="dxa" w:w="170"/>
+              <w:right w:type="dxa" w:w="170"/>
+            </w:tcMar>
+            <w:vAlign w:val="center"/>
+          </w:tcPr>
+          <w:p>
+            <w:pPr>
+              <w:jc w:val="left"/>
+            </w:pPr>
+            <w:r>
+              <w:rPr>
+                <w:rFonts w:ascii="NanumGothic" w:cs="NanumGothic" w:eastAsia="NanumGothic" w:hAnsi="NanumGothic"/>
+                <w:sz w:val="20"/>
+                <w:szCs w:val="20"/>
+              </w:rPr>
+              <w:t xml:space="preserve"/>
+            </w:r>
+          </w:p>
+        </w:tc>
+        <w:tc>
+          <w:tcPr>
+            <w:tcW w:type="dxa" w:w="1133"/>
             <w:tcBorders>
               <w:top w:val="single" w:color="000000" w:sz="4"/>
               <w:left w:val="single" w:color="000000" w:sz="4"/>
@@ -699,135 +737,231 @@
         </w:tc>
         <w:tc>
           <w:tcPr>
-            <w:tcW w:type="dxa" w:w="1360"/>
-            <w:tcBorders>
-              <w:top w:val="single" w:color="000000" w:sz="4"/>
-              <w:left w:val="single" w:color="000000" w:sz="4"/>
-              <w:bottom w:val="single" w:color="000000" w:sz="4"/>
-              <w:right w:val="single" w:color="000000" w:sz="4"/>
-            </w:tcBorders>
-            <w:shd w:fill="ffffff" w:color="auto" w:val="clear"/>
-            <w:tcMar>
-              <w:top w:type="dxa" w:w="170"/>
-              <w:left w:type="dxa" w:w="170"/>
-              <w:bottom w:type="dxa" w:w="170"/>
-              <w:right w:type="dxa" w:w="170"/>
-            </w:tcMar>
-            <w:vAlign w:val="center"/>
-          </w:tcPr>
-          <w:p>
-            <w:pPr>
-              <w:jc w:val="left"/>
-            </w:pPr>
-            <w:r>
-              <w:rPr>
-                <w:rFonts w:ascii="NanumGothic" w:cs="NanumGothic" w:eastAsia="NanumGothic" w:hAnsi="NanumGothic"/>
-                <w:sz w:val="20"/>
-                <w:szCs w:val="20"/>
-              </w:rPr>
-              <w:t xml:space="preserve"/>
-            </w:r>
-          </w:p>
-        </w:tc>
-        <w:tc>
-          <w:tcPr>
-            <w:tcW w:type="dxa" w:w="1360"/>
-            <w:tcBorders>
-              <w:top w:val="single" w:color="000000" w:sz="4"/>
-              <w:left w:val="single" w:color="000000" w:sz="4"/>
-              <w:bottom w:val="single" w:color="000000" w:sz="4"/>
-              <w:right w:val="single" w:color="000000" w:sz="4"/>
-            </w:tcBorders>
-            <w:shd w:fill="ffffff" w:color="auto" w:val="clear"/>
-            <w:tcMar>
-              <w:top w:type="dxa" w:w="170"/>
-              <w:left w:type="dxa" w:w="170"/>
-              <w:bottom w:type="dxa" w:w="170"/>
-              <w:right w:type="dxa" w:w="170"/>
-            </w:tcMar>
-            <w:vAlign w:val="center"/>
-          </w:tcPr>
-          <w:p>
-            <w:pPr>
-              <w:jc w:val="left"/>
-            </w:pPr>
-            <w:r>
-              <w:rPr>
-                <w:rFonts w:ascii="NanumGothic" w:cs="NanumGothic" w:eastAsia="NanumGothic" w:hAnsi="NanumGothic"/>
-                <w:sz w:val="20"/>
-                <w:szCs w:val="20"/>
-              </w:rPr>
-              <w:t xml:space="preserve"/>
-            </w:r>
-          </w:p>
-        </w:tc>
-        <w:tc>
-          <w:tcPr>
-            <w:tcW w:type="dxa" w:w="2267"/>
-            <w:tcBorders>
-              <w:top w:val="single" w:color="000000" w:sz="4"/>
-              <w:left w:val="single" w:color="000000" w:sz="4"/>
-              <w:bottom w:val="single" w:color="000000" w:sz="4"/>
-              <w:right w:val="single" w:color="000000" w:sz="4"/>
-            </w:tcBorders>
-            <w:shd w:fill="ffffff" w:color="auto" w:val="clear"/>
-            <w:tcMar>
-              <w:top w:type="dxa" w:w="170"/>
-              <w:left w:type="dxa" w:w="170"/>
-              <w:bottom w:type="dxa" w:w="170"/>
-              <w:right w:type="dxa" w:w="170"/>
-            </w:tcMar>
-            <w:vAlign w:val="center"/>
-          </w:tcPr>
-          <w:p>
-            <w:pPr>
-              <w:jc w:val="left"/>
-            </w:pPr>
-            <w:r>
-              <w:rPr>
-                <w:rFonts w:ascii="NanumGothic" w:cs="NanumGothic" w:eastAsia="NanumGothic" w:hAnsi="NanumGothic"/>
-                <w:sz w:val="20"/>
-                <w:szCs w:val="20"/>
-              </w:rPr>
-              <w:t xml:space="preserve"/>
-            </w:r>
-          </w:p>
-        </w:tc>
-        <w:tc>
-          <w:tcPr>
-            <w:tcW w:type="dxa" w:w="2267"/>
-            <w:tcBorders>
-              <w:top w:val="single" w:color="000000" w:sz="4"/>
-              <w:left w:val="single" w:color="000000" w:sz="4"/>
-              <w:bottom w:val="single" w:color="000000" w:sz="4"/>
-              <w:right w:val="single" w:color="000000" w:sz="4"/>
-            </w:tcBorders>
-            <w:shd w:fill="ffffff" w:color="auto" w:val="clear"/>
-            <w:tcMar>
-              <w:top w:type="dxa" w:w="170"/>
-              <w:left w:type="dxa" w:w="170"/>
-              <w:bottom w:type="dxa" w:w="170"/>
-              <w:right w:type="dxa" w:w="170"/>
-            </w:tcMar>
-            <w:vAlign w:val="center"/>
-          </w:tcPr>
-          <w:p>
-            <w:pPr>
-              <w:jc w:val="left"/>
-            </w:pPr>
-            <w:r>
-              <w:rPr>
-                <w:rFonts w:ascii="NanumGothic" w:cs="NanumGothic" w:eastAsia="NanumGothic" w:hAnsi="NanumGothic"/>
-                <w:sz w:val="20"/>
-                <w:szCs w:val="20"/>
-              </w:rPr>
-              <w:t xml:space="preserve"/>
-            </w:r>
-          </w:p>
-        </w:tc>
-        <w:tc>
-          <w:tcPr>
-            <w:tcW w:type="dxa" w:w="1303"/>
+            <w:tcW w:type="dxa" w:w="1247"/>
+            <w:tcBorders>
+              <w:top w:val="single" w:color="000000" w:sz="4"/>
+              <w:left w:val="single" w:color="000000" w:sz="4"/>
+              <w:bottom w:val="single" w:color="000000" w:sz="4"/>
+              <w:right w:val="single" w:color="000000" w:sz="4"/>
+            </w:tcBorders>
+            <w:shd w:fill="ffffff" w:color="auto" w:val="clear"/>
+            <w:tcMar>
+              <w:top w:type="dxa" w:w="170"/>
+              <w:left w:type="dxa" w:w="170"/>
+              <w:bottom w:type="dxa" w:w="170"/>
+              <w:right w:type="dxa" w:w="170"/>
+            </w:tcMar>
+            <w:vAlign w:val="center"/>
+          </w:tcPr>
+          <w:p>
+            <w:pPr>
+              <w:jc w:val="left"/>
+            </w:pPr>
+            <w:r>
+              <w:rPr>
+                <w:rFonts w:ascii="NanumGothic" w:cs="NanumGothic" w:eastAsia="NanumGothic" w:hAnsi="NanumGothic"/>
+                <w:sz w:val="20"/>
+                <w:szCs w:val="20"/>
+              </w:rPr>
+              <w:t xml:space="preserve"/>
+            </w:r>
+          </w:p>
+        </w:tc>
+        <w:tc>
+          <w:tcPr>
+            <w:tcW w:type="dxa" w:w="793"/>
+            <w:tcBorders>
+              <w:top w:val="single" w:color="000000" w:sz="4"/>
+              <w:left w:val="single" w:color="000000" w:sz="4"/>
+              <w:bottom w:val="single" w:color="000000" w:sz="4"/>
+              <w:right w:val="single" w:color="000000" w:sz="4"/>
+            </w:tcBorders>
+            <w:shd w:fill="ffffff" w:color="auto" w:val="clear"/>
+            <w:tcMar>
+              <w:top w:type="dxa" w:w="170"/>
+              <w:left w:type="dxa" w:w="170"/>
+              <w:bottom w:type="dxa" w:w="170"/>
+              <w:right w:type="dxa" w:w="170"/>
+            </w:tcMar>
+            <w:vAlign w:val="center"/>
+          </w:tcPr>
+          <w:p>
+            <w:pPr>
+              <w:jc w:val="left"/>
+            </w:pPr>
+            <w:r>
+              <w:rPr>
+                <w:rFonts w:ascii="NanumGothic" w:cs="NanumGothic" w:eastAsia="NanumGothic" w:hAnsi="NanumGothic"/>
+                <w:sz w:val="20"/>
+                <w:szCs w:val="20"/>
+              </w:rPr>
+              <w:t xml:space="preserve"/>
+            </w:r>
+          </w:p>
+        </w:tc>
+        <w:tc>
+          <w:tcPr>
+            <w:tcW w:type="dxa" w:w="1247"/>
+            <w:tcBorders>
+              <w:top w:val="single" w:color="000000" w:sz="4"/>
+              <w:left w:val="single" w:color="000000" w:sz="4"/>
+              <w:bottom w:val="single" w:color="000000" w:sz="4"/>
+              <w:right w:val="single" w:color="000000" w:sz="4"/>
+            </w:tcBorders>
+            <w:shd w:fill="ffffff" w:color="auto" w:val="clear"/>
+            <w:tcMar>
+              <w:top w:type="dxa" w:w="170"/>
+              <w:left w:type="dxa" w:w="170"/>
+              <w:bottom w:type="dxa" w:w="170"/>
+              <w:right w:type="dxa" w:w="170"/>
+            </w:tcMar>
+            <w:vAlign w:val="center"/>
+          </w:tcPr>
+          <w:p>
+            <w:pPr>
+              <w:jc w:val="left"/>
+            </w:pPr>
+            <w:r>
+              <w:rPr>
+                <w:rFonts w:ascii="NanumGothic" w:cs="NanumGothic" w:eastAsia="NanumGothic" w:hAnsi="NanumGothic"/>
+                <w:sz w:val="20"/>
+                <w:szCs w:val="20"/>
+              </w:rPr>
+              <w:t xml:space="preserve"/>
+            </w:r>
+          </w:p>
+        </w:tc>
+        <w:tc>
+          <w:tcPr>
+            <w:tcW w:type="dxa" w:w="1247"/>
+            <w:tcBorders>
+              <w:top w:val="single" w:color="000000" w:sz="4"/>
+              <w:left w:val="single" w:color="000000" w:sz="4"/>
+              <w:bottom w:val="single" w:color="000000" w:sz="4"/>
+              <w:right w:val="single" w:color="000000" w:sz="4"/>
+            </w:tcBorders>
+            <w:shd w:fill="ffffff" w:color="auto" w:val="clear"/>
+            <w:tcMar>
+              <w:top w:type="dxa" w:w="170"/>
+              <w:left w:type="dxa" w:w="170"/>
+              <w:bottom w:type="dxa" w:w="170"/>
+              <w:right w:type="dxa" w:w="170"/>
+            </w:tcMar>
+            <w:vAlign w:val="center"/>
+          </w:tcPr>
+          <w:p>
+            <w:pPr>
+              <w:jc w:val="left"/>
+            </w:pPr>
+            <w:r>
+              <w:rPr>
+                <w:rFonts w:ascii="NanumGothic" w:cs="NanumGothic" w:eastAsia="NanumGothic" w:hAnsi="NanumGothic"/>
+                <w:sz w:val="20"/>
+                <w:szCs w:val="20"/>
+              </w:rPr>
+              <w:t xml:space="preserve"/>
+            </w:r>
+          </w:p>
+        </w:tc>
+        <w:tc>
+          <w:tcPr>
+            <w:tcW w:type="dxa" w:w="1133"/>
+            <w:tcBorders>
+              <w:top w:val="single" w:color="000000" w:sz="4"/>
+              <w:left w:val="single" w:color="000000" w:sz="4"/>
+              <w:bottom w:val="single" w:color="000000" w:sz="4"/>
+              <w:right w:val="single" w:color="000000" w:sz="4"/>
+            </w:tcBorders>
+            <w:shd w:fill="ffffff" w:color="auto" w:val="clear"/>
+            <w:tcMar>
+              <w:top w:type="dxa" w:w="170"/>
+              <w:left w:type="dxa" w:w="170"/>
+              <w:bottom w:type="dxa" w:w="170"/>
+              <w:right w:type="dxa" w:w="170"/>
+            </w:tcMar>
+            <w:vAlign w:val="center"/>
+          </w:tcPr>
+          <w:p>
+            <w:pPr>
+              <w:jc w:val="left"/>
+            </w:pPr>
+            <w:r>
+              <w:rPr>
+                <w:rFonts w:ascii="NanumGothic" w:cs="NanumGothic" w:eastAsia="NanumGothic" w:hAnsi="NanumGothic"/>
+                <w:sz w:val="20"/>
+                <w:szCs w:val="20"/>
+              </w:rPr>
+              <w:t xml:space="preserve"/>
+            </w:r>
+          </w:p>
+        </w:tc>
+        <w:tc>
+          <w:tcPr>
+            <w:tcW w:type="dxa" w:w="1814"/>
+            <w:tcBorders>
+              <w:top w:val="single" w:color="000000" w:sz="4"/>
+              <w:left w:val="single" w:color="000000" w:sz="4"/>
+              <w:bottom w:val="single" w:color="000000" w:sz="4"/>
+              <w:right w:val="single" w:color="000000" w:sz="4"/>
+            </w:tcBorders>
+            <w:shd w:fill="ffffff" w:color="auto" w:val="clear"/>
+            <w:tcMar>
+              <w:top w:type="dxa" w:w="170"/>
+              <w:left w:type="dxa" w:w="170"/>
+              <w:bottom w:type="dxa" w:w="170"/>
+              <w:right w:type="dxa" w:w="170"/>
+            </w:tcMar>
+            <w:vAlign w:val="center"/>
+          </w:tcPr>
+          <w:p>
+            <w:pPr>
+              <w:jc w:val="left"/>
+            </w:pPr>
+            <w:r>
+              <w:rPr>
+                <w:rFonts w:ascii="NanumGothic" w:cs="NanumGothic" w:eastAsia="NanumGothic" w:hAnsi="NanumGothic"/>
+                <w:sz w:val="20"/>
+                <w:szCs w:val="20"/>
+              </w:rPr>
+              <w:t xml:space="preserve"/>
+            </w:r>
+          </w:p>
+        </w:tc>
+        <w:tc>
+          <w:tcPr>
+            <w:tcW w:type="dxa" w:w="1814"/>
+            <w:tcBorders>
+              <w:top w:val="single" w:color="000000" w:sz="4"/>
+              <w:left w:val="single" w:color="000000" w:sz="4"/>
+              <w:bottom w:val="single" w:color="000000" w:sz="4"/>
+              <w:right w:val="single" w:color="000000" w:sz="4"/>
+            </w:tcBorders>
+            <w:shd w:fill="ffffff" w:color="auto" w:val="clear"/>
+            <w:tcMar>
+              <w:top w:type="dxa" w:w="170"/>
+              <w:left w:type="dxa" w:w="170"/>
+              <w:bottom w:type="dxa" w:w="170"/>
+              <w:right w:type="dxa" w:w="170"/>
+            </w:tcMar>
+            <w:vAlign w:val="center"/>
+          </w:tcPr>
+          <w:p>
+            <w:pPr>
+              <w:jc w:val="left"/>
+            </w:pPr>
+            <w:r>
+              <w:rPr>
+                <w:rFonts w:ascii="NanumGothic" w:cs="NanumGothic" w:eastAsia="NanumGothic" w:hAnsi="NanumGothic"/>
+                <w:sz w:val="20"/>
+                <w:szCs w:val="20"/>
+              </w:rPr>
+              <w:t xml:space="preserve"/>
+            </w:r>
+          </w:p>
+        </w:tc>
+        <w:tc>
+          <w:tcPr>
+            <w:tcW w:type="dxa" w:w="1077"/>
             <w:tcBorders>
               <w:top w:val="single" w:color="000000" w:sz="4"/>
               <w:left w:val="single" w:color="000000" w:sz="4"/>
@@ -864,7 +998,7 @@
         </w:trPr>
         <w:tc>
           <w:tcPr>
-            <w:tcW w:type="dxa" w:w="2154"/>
+            <w:tcW w:type="dxa" w:w="1700"/>
             <w:tcBorders>
               <w:top w:val="single" w:color="000000" w:sz="4"/>
               <w:left w:val="single" w:color="000000" w:sz="4"/>
@@ -896,7 +1030,7 @@
         </w:tc>
         <w:tc>
           <w:tcPr>
-            <w:tcW w:type="dxa" w:w="1587"/>
+            <w:tcW w:type="dxa" w:w="1133"/>
             <w:tcBorders>
               <w:top w:val="single" w:color="000000" w:sz="4"/>
               <w:left w:val="single" w:color="000000" w:sz="4"/>
@@ -928,7 +1062,7 @@
         </w:tc>
         <w:tc>
           <w:tcPr>
-            <w:tcW w:type="dxa" w:w="907"/>
+            <w:tcW w:type="dxa" w:w="1360"/>
             <w:tcBorders>
               <w:top w:val="single" w:color="000000" w:sz="4"/>
               <w:left w:val="single" w:color="000000" w:sz="4"/>
@@ -960,7 +1094,7 @@
         </w:tc>
         <w:tc>
           <w:tcPr>
-            <w:tcW w:type="dxa" w:w="1360"/>
+            <w:tcW w:type="dxa" w:w="1247"/>
             <w:tcBorders>
               <w:top w:val="single" w:color="000000" w:sz="4"/>
               <w:left w:val="single" w:color="000000" w:sz="4"/>
@@ -992,7 +1126,7 @@
         </w:tc>
         <w:tc>
           <w:tcPr>
-            <w:tcW w:type="dxa" w:w="1360"/>
+            <w:tcW w:type="dxa" w:w="793"/>
             <w:tcBorders>
               <w:top w:val="single" w:color="000000" w:sz="4"/>
               <w:left w:val="single" w:color="000000" w:sz="4"/>
@@ -1024,7 +1158,7 @@
         </w:tc>
         <w:tc>
           <w:tcPr>
-            <w:tcW w:type="dxa" w:w="1360"/>
+            <w:tcW w:type="dxa" w:w="1247"/>
             <w:tcBorders>
               <w:top w:val="single" w:color="000000" w:sz="4"/>
               <w:left w:val="single" w:color="000000" w:sz="4"/>
@@ -1056,7 +1190,7 @@
         </w:tc>
         <w:tc>
           <w:tcPr>
-            <w:tcW w:type="dxa" w:w="2267"/>
+            <w:tcW w:type="dxa" w:w="1247"/>
             <w:tcBorders>
               <w:top w:val="single" w:color="000000" w:sz="4"/>
               <w:left w:val="single" w:color="000000" w:sz="4"/>
@@ -1088,7 +1222,7 @@
         </w:tc>
         <w:tc>
           <w:tcPr>
-            <w:tcW w:type="dxa" w:w="2267"/>
+            <w:tcW w:type="dxa" w:w="1133"/>
             <w:tcBorders>
               <w:top w:val="single" w:color="000000" w:sz="4"/>
               <w:left w:val="single" w:color="000000" w:sz="4"/>
@@ -1120,7 +1254,71 @@
         </w:tc>
         <w:tc>
           <w:tcPr>
-            <w:tcW w:type="dxa" w:w="1303"/>
+            <w:tcW w:type="dxa" w:w="1814"/>
+            <w:tcBorders>
+              <w:top w:val="single" w:color="000000" w:sz="4"/>
+              <w:left w:val="single" w:color="000000" w:sz="4"/>
+              <w:bottom w:val="single" w:color="000000" w:sz="4"/>
+              <w:right w:val="single" w:color="000000" w:sz="4"/>
+            </w:tcBorders>
+            <w:shd w:fill="F5F5F5" w:color="auto" w:val="clear"/>
+            <w:tcMar>
+              <w:top w:type="dxa" w:w="170"/>
+              <w:left w:type="dxa" w:w="170"/>
+              <w:bottom w:type="dxa" w:w="170"/>
+              <w:right w:type="dxa" w:w="170"/>
+            </w:tcMar>
+            <w:vAlign w:val="center"/>
+          </w:tcPr>
+          <w:p>
+            <w:pPr>
+              <w:jc w:val="left"/>
+            </w:pPr>
+            <w:r>
+              <w:rPr>
+                <w:rFonts w:ascii="NanumGothic" w:cs="NanumGothic" w:eastAsia="NanumGothic" w:hAnsi="NanumGothic"/>
+                <w:sz w:val="20"/>
+                <w:szCs w:val="20"/>
+              </w:rPr>
+              <w:t xml:space="preserve"/>
+            </w:r>
+          </w:p>
+        </w:tc>
+        <w:tc>
+          <w:tcPr>
+            <w:tcW w:type="dxa" w:w="1814"/>
+            <w:tcBorders>
+              <w:top w:val="single" w:color="000000" w:sz="4"/>
+              <w:left w:val="single" w:color="000000" w:sz="4"/>
+              <w:bottom w:val="single" w:color="000000" w:sz="4"/>
+              <w:right w:val="single" w:color="000000" w:sz="4"/>
+            </w:tcBorders>
+            <w:shd w:fill="F5F5F5" w:color="auto" w:val="clear"/>
+            <w:tcMar>
+              <w:top w:type="dxa" w:w="170"/>
+              <w:left w:type="dxa" w:w="170"/>
+              <w:bottom w:type="dxa" w:w="170"/>
+              <w:right w:type="dxa" w:w="170"/>
+            </w:tcMar>
+            <w:vAlign w:val="center"/>
+          </w:tcPr>
+          <w:p>
+            <w:pPr>
+              <w:jc w:val="left"/>
+            </w:pPr>
+            <w:r>
+              <w:rPr>
+                <w:rFonts w:ascii="NanumGothic" w:cs="NanumGothic" w:eastAsia="NanumGothic" w:hAnsi="NanumGothic"/>
+                <w:sz w:val="20"/>
+                <w:szCs w:val="20"/>
+              </w:rPr>
+              <w:t xml:space="preserve"/>
+            </w:r>
+          </w:p>
+        </w:tc>
+        <w:tc>
+          <w:tcPr>
+            <w:tcW w:type="dxa" w:w="1077"/>
             <w:tcBorders>
               <w:top w:val="single" w:color="000000" w:sz="4"/>
               <w:left w:val="single" w:color="000000" w:sz="4"/>
@@ -1157,71 +1355,39 @@
         </w:trPr>
         <w:tc>
           <w:tcPr>
-            <w:tcW w:type="dxa" w:w="2154"/>
-            <w:tcBorders>
-              <w:top w:val="single" w:color="000000" w:sz="4"/>
-              <w:left w:val="single" w:color="000000" w:sz="4"/>
-              <w:bottom w:val="single" w:color="000000" w:sz="4"/>
-              <w:right w:val="single" w:color="000000" w:sz="4"/>
-            </w:tcBorders>
-            <w:shd w:fill="ffffff" w:color="auto" w:val="clear"/>
-            <w:tcMar>
-              <w:top w:type="dxa" w:w="170"/>
-              <w:left w:type="dxa" w:w="170"/>
-              <w:bottom w:type="dxa" w:w="170"/>
-              <w:right w:type="dxa" w:w="170"/>
-            </w:tcMar>
-            <w:vAlign w:val="center"/>
-          </w:tcPr>
-          <w:p>
-            <w:pPr>
-              <w:jc w:val="left"/>
-            </w:pPr>
-            <w:r>
-              <w:rPr>
-                <w:rFonts w:ascii="NanumGothic" w:cs="NanumGothic" w:eastAsia="NanumGothic" w:hAnsi="NanumGothic"/>
-                <w:sz w:val="20"/>
-                <w:szCs w:val="20"/>
-              </w:rPr>
-              <w:t xml:space="preserve"/>
-            </w:r>
-          </w:p>
-        </w:tc>
-        <w:tc>
-          <w:tcPr>
-            <w:tcW w:type="dxa" w:w="1587"/>
-            <w:tcBorders>
-              <w:top w:val="single" w:color="000000" w:sz="4"/>
-              <w:left w:val="single" w:color="000000" w:sz="4"/>
-              <w:bottom w:val="single" w:color="000000" w:sz="4"/>
-              <w:right w:val="single" w:color="000000" w:sz="4"/>
-            </w:tcBorders>
-            <w:shd w:fill="ffffff" w:color="auto" w:val="clear"/>
-            <w:tcMar>
-              <w:top w:type="dxa" w:w="170"/>
-              <w:left w:type="dxa" w:w="170"/>
-              <w:bottom w:type="dxa" w:w="170"/>
-              <w:right w:type="dxa" w:w="170"/>
-            </w:tcMar>
-            <w:vAlign w:val="center"/>
-          </w:tcPr>
-          <w:p>
-            <w:pPr>
-              <w:jc w:val="left"/>
-            </w:pPr>
-            <w:r>
-              <w:rPr>
-                <w:rFonts w:ascii="NanumGothic" w:cs="NanumGothic" w:eastAsia="NanumGothic" w:hAnsi="NanumGothic"/>
-                <w:sz w:val="20"/>
-                <w:szCs w:val="20"/>
-              </w:rPr>
-              <w:t xml:space="preserve"/>
-            </w:r>
-          </w:p>
-        </w:tc>
-        <w:tc>
-          <w:tcPr>
-            <w:tcW w:type="dxa" w:w="907"/>
+            <w:tcW w:type="dxa" w:w="1700"/>
+            <w:tcBorders>
+              <w:top w:val="single" w:color="000000" w:sz="4"/>
+              <w:left w:val="single" w:color="000000" w:sz="4"/>
+              <w:bottom w:val="single" w:color="000000" w:sz="4"/>
+              <w:right w:val="single" w:color="000000" w:sz="4"/>
+            </w:tcBorders>
+            <w:shd w:fill="ffffff" w:color="auto" w:val="clear"/>
+            <w:tcMar>
+              <w:top w:type="dxa" w:w="170"/>
+              <w:left w:type="dxa" w:w="170"/>
+              <w:bottom w:type="dxa" w:w="170"/>
+              <w:right w:type="dxa" w:w="170"/>
+            </w:tcMar>
+            <w:vAlign w:val="center"/>
+          </w:tcPr>
+          <w:p>
+            <w:pPr>
+              <w:jc w:val="left"/>
+            </w:pPr>
+            <w:r>
+              <w:rPr>
+                <w:rFonts w:ascii="NanumGothic" w:cs="NanumGothic" w:eastAsia="NanumGothic" w:hAnsi="NanumGothic"/>
+                <w:sz w:val="20"/>
+                <w:szCs w:val="20"/>
+              </w:rPr>
+              <w:t xml:space="preserve"/>
+            </w:r>
+          </w:p>
+        </w:tc>
+        <w:tc>
+          <w:tcPr>
+            <w:tcW w:type="dxa" w:w="1133"/>
             <w:tcBorders>
               <w:top w:val="single" w:color="000000" w:sz="4"/>
               <w:left w:val="single" w:color="000000" w:sz="4"/>
@@ -1285,135 +1451,231 @@
         </w:tc>
         <w:tc>
           <w:tcPr>
-            <w:tcW w:type="dxa" w:w="1360"/>
-            <w:tcBorders>
-              <w:top w:val="single" w:color="000000" w:sz="4"/>
-              <w:left w:val="single" w:color="000000" w:sz="4"/>
-              <w:bottom w:val="single" w:color="000000" w:sz="4"/>
-              <w:right w:val="single" w:color="000000" w:sz="4"/>
-            </w:tcBorders>
-            <w:shd w:fill="ffffff" w:color="auto" w:val="clear"/>
-            <w:tcMar>
-              <w:top w:type="dxa" w:w="170"/>
-              <w:left w:type="dxa" w:w="170"/>
-              <w:bottom w:type="dxa" w:w="170"/>
-              <w:right w:type="dxa" w:w="170"/>
-            </w:tcMar>
-            <w:vAlign w:val="center"/>
-          </w:tcPr>
-          <w:p>
-            <w:pPr>
-              <w:jc w:val="left"/>
-            </w:pPr>
-            <w:r>
-              <w:rPr>
-                <w:rFonts w:ascii="NanumGothic" w:cs="NanumGothic" w:eastAsia="NanumGothic" w:hAnsi="NanumGothic"/>
-                <w:sz w:val="20"/>
-                <w:szCs w:val="20"/>
-              </w:rPr>
-              <w:t xml:space="preserve"/>
-            </w:r>
-          </w:p>
-        </w:tc>
-        <w:tc>
-          <w:tcPr>
-            <w:tcW w:type="dxa" w:w="1360"/>
-            <w:tcBorders>
-              <w:top w:val="single" w:color="000000" w:sz="4"/>
-              <w:left w:val="single" w:color="000000" w:sz="4"/>
-              <w:bottom w:val="single" w:color="000000" w:sz="4"/>
-              <w:right w:val="single" w:color="000000" w:sz="4"/>
-            </w:tcBorders>
-            <w:shd w:fill="ffffff" w:color="auto" w:val="clear"/>
-            <w:tcMar>
-              <w:top w:type="dxa" w:w="170"/>
-              <w:left w:type="dxa" w:w="170"/>
-              <w:bottom w:type="dxa" w:w="170"/>
-              <w:right w:type="dxa" w:w="170"/>
-            </w:tcMar>
-            <w:vAlign w:val="center"/>
-          </w:tcPr>
-          <w:p>
-            <w:pPr>
-              <w:jc w:val="left"/>
-            </w:pPr>
-            <w:r>
-              <w:rPr>
-                <w:rFonts w:ascii="NanumGothic" w:cs="NanumGothic" w:eastAsia="NanumGothic" w:hAnsi="NanumGothic"/>
-                <w:sz w:val="20"/>
-                <w:szCs w:val="20"/>
-              </w:rPr>
-              <w:t xml:space="preserve"/>
-            </w:r>
-          </w:p>
-        </w:tc>
-        <w:tc>
-          <w:tcPr>
-            <w:tcW w:type="dxa" w:w="2267"/>
-            <w:tcBorders>
-              <w:top w:val="single" w:color="000000" w:sz="4"/>
-              <w:left w:val="single" w:color="000000" w:sz="4"/>
-              <w:bottom w:val="single" w:color="000000" w:sz="4"/>
-              <w:right w:val="single" w:color="000000" w:sz="4"/>
-            </w:tcBorders>
-            <w:shd w:fill="ffffff" w:color="auto" w:val="clear"/>
-            <w:tcMar>
-              <w:top w:type="dxa" w:w="170"/>
-              <w:left w:type="dxa" w:w="170"/>
-              <w:bottom w:type="dxa" w:w="170"/>
-              <w:right w:type="dxa" w:w="170"/>
-            </w:tcMar>
-            <w:vAlign w:val="center"/>
-          </w:tcPr>
-          <w:p>
-            <w:pPr>
-              <w:jc w:val="left"/>
-            </w:pPr>
-            <w:r>
-              <w:rPr>
-                <w:rFonts w:ascii="NanumGothic" w:cs="NanumGothic" w:eastAsia="NanumGothic" w:hAnsi="NanumGothic"/>
-                <w:sz w:val="20"/>
-                <w:szCs w:val="20"/>
-              </w:rPr>
-              <w:t xml:space="preserve"/>
-            </w:r>
-          </w:p>
-        </w:tc>
-        <w:tc>
-          <w:tcPr>
-            <w:tcW w:type="dxa" w:w="2267"/>
-            <w:tcBorders>
-              <w:top w:val="single" w:color="000000" w:sz="4"/>
-              <w:left w:val="single" w:color="000000" w:sz="4"/>
-              <w:bottom w:val="single" w:color="000000" w:sz="4"/>
-              <w:right w:val="single" w:color="000000" w:sz="4"/>
-            </w:tcBorders>
-            <w:shd w:fill="ffffff" w:color="auto" w:val="clear"/>
-            <w:tcMar>
-              <w:top w:type="dxa" w:w="170"/>
-              <w:left w:type="dxa" w:w="170"/>
-              <w:bottom w:type="dxa" w:w="170"/>
-              <w:right w:type="dxa" w:w="170"/>
-            </w:tcMar>
-            <w:vAlign w:val="center"/>
-          </w:tcPr>
-          <w:p>
-            <w:pPr>
-              <w:jc w:val="left"/>
-            </w:pPr>
-            <w:r>
-              <w:rPr>
-                <w:rFonts w:ascii="NanumGothic" w:cs="NanumGothic" w:eastAsia="NanumGothic" w:hAnsi="NanumGothic"/>
-                <w:sz w:val="20"/>
-                <w:szCs w:val="20"/>
-              </w:rPr>
-              <w:t xml:space="preserve"/>
-            </w:r>
-          </w:p>
-        </w:tc>
-        <w:tc>
-          <w:tcPr>
-            <w:tcW w:type="dxa" w:w="1303"/>
+            <w:tcW w:type="dxa" w:w="1247"/>
+            <w:tcBorders>
+              <w:top w:val="single" w:color="000000" w:sz="4"/>
+              <w:left w:val="single" w:color="000000" w:sz="4"/>
+              <w:bottom w:val="single" w:color="000000" w:sz="4"/>
+              <w:right w:val="single" w:color="000000" w:sz="4"/>
+            </w:tcBorders>
+            <w:shd w:fill="ffffff" w:color="auto" w:val="clear"/>
+            <w:tcMar>
+              <w:top w:type="dxa" w:w="170"/>
+              <w:left w:type="dxa" w:w="170"/>
+              <w:bottom w:type="dxa" w:w="170"/>
+              <w:right w:type="dxa" w:w="170"/>
+            </w:tcMar>
+            <w:vAlign w:val="center"/>
+          </w:tcPr>
+          <w:p>
+            <w:pPr>
+              <w:jc w:val="left"/>
+            </w:pPr>
+            <w:r>
+              <w:rPr>
+                <w:rFonts w:ascii="NanumGothic" w:cs="NanumGothic" w:eastAsia="NanumGothic" w:hAnsi="NanumGothic"/>
+                <w:sz w:val="20"/>
+                <w:szCs w:val="20"/>
+              </w:rPr>
+              <w:t xml:space="preserve"/>
+            </w:r>
+          </w:p>
+        </w:tc>
+        <w:tc>
+          <w:tcPr>
+            <w:tcW w:type="dxa" w:w="793"/>
+            <w:tcBorders>
+              <w:top w:val="single" w:color="000000" w:sz="4"/>
+              <w:left w:val="single" w:color="000000" w:sz="4"/>
+              <w:bottom w:val="single" w:color="000000" w:sz="4"/>
+              <w:right w:val="single" w:color="000000" w:sz="4"/>
+            </w:tcBorders>
+            <w:shd w:fill="ffffff" w:color="auto" w:val="clear"/>
+            <w:tcMar>
+              <w:top w:type="dxa" w:w="170"/>
+              <w:left w:type="dxa" w:w="170"/>
+              <w:bottom w:type="dxa" w:w="170"/>
+              <w:right w:type="dxa" w:w="170"/>
+            </w:tcMar>
+            <w:vAlign w:val="center"/>
+          </w:tcPr>
+          <w:p>
+            <w:pPr>
+              <w:jc w:val="left"/>
+            </w:pPr>
+            <w:r>
+              <w:rPr>
+                <w:rFonts w:ascii="NanumGothic" w:cs="NanumGothic" w:eastAsia="NanumGothic" w:hAnsi="NanumGothic"/>
+                <w:sz w:val="20"/>
+                <w:szCs w:val="20"/>
+              </w:rPr>
+              <w:t xml:space="preserve"/>
+            </w:r>
+          </w:p>
+        </w:tc>
+        <w:tc>
+          <w:tcPr>
+            <w:tcW w:type="dxa" w:w="1247"/>
+            <w:tcBorders>
+              <w:top w:val="single" w:color="000000" w:sz="4"/>
+              <w:left w:val="single" w:color="000000" w:sz="4"/>
+              <w:bottom w:val="single" w:color="000000" w:sz="4"/>
+              <w:right w:val="single" w:color="000000" w:sz="4"/>
+            </w:tcBorders>
+            <w:shd w:fill="ffffff" w:color="auto" w:val="clear"/>
+            <w:tcMar>
+              <w:top w:type="dxa" w:w="170"/>
+              <w:left w:type="dxa" w:w="170"/>
+              <w:bottom w:type="dxa" w:w="170"/>
+              <w:right w:type="dxa" w:w="170"/>
+            </w:tcMar>
+            <w:vAlign w:val="center"/>
+          </w:tcPr>
+          <w:p>
+            <w:pPr>
+              <w:jc w:val="left"/>
+            </w:pPr>
+            <w:r>
+              <w:rPr>
+                <w:rFonts w:ascii="NanumGothic" w:cs="NanumGothic" w:eastAsia="NanumGothic" w:hAnsi="NanumGothic"/>
+                <w:sz w:val="20"/>
+                <w:szCs w:val="20"/>
+              </w:rPr>
+              <w:t xml:space="preserve"/>
+            </w:r>
+          </w:p>
+        </w:tc>
+        <w:tc>
+          <w:tcPr>
+            <w:tcW w:type="dxa" w:w="1247"/>
+            <w:tcBorders>
+              <w:top w:val="single" w:color="000000" w:sz="4"/>
+              <w:left w:val="single" w:color="000000" w:sz="4"/>
+              <w:bottom w:val="single" w:color="000000" w:sz="4"/>
+              <w:right w:val="single" w:color="000000" w:sz="4"/>
+            </w:tcBorders>
+            <w:shd w:fill="ffffff" w:color="auto" w:val="clear"/>
+            <w:tcMar>
+              <w:top w:type="dxa" w:w="170"/>
+              <w:left w:type="dxa" w:w="170"/>
+              <w:bottom w:type="dxa" w:w="170"/>
+              <w:right w:type="dxa" w:w="170"/>
+            </w:tcMar>
+            <w:vAlign w:val="center"/>
+          </w:tcPr>
+          <w:p>
+            <w:pPr>
+              <w:jc w:val="left"/>
+            </w:pPr>
+            <w:r>
+              <w:rPr>
+                <w:rFonts w:ascii="NanumGothic" w:cs="NanumGothic" w:eastAsia="NanumGothic" w:hAnsi="NanumGothic"/>
+                <w:sz w:val="20"/>
+                <w:szCs w:val="20"/>
+              </w:rPr>
+              <w:t xml:space="preserve"/>
+            </w:r>
+          </w:p>
+        </w:tc>
+        <w:tc>
+          <w:tcPr>
+            <w:tcW w:type="dxa" w:w="1133"/>
+            <w:tcBorders>
+              <w:top w:val="single" w:color="000000" w:sz="4"/>
+              <w:left w:val="single" w:color="000000" w:sz="4"/>
+              <w:bottom w:val="single" w:color="000000" w:sz="4"/>
+              <w:right w:val="single" w:color="000000" w:sz="4"/>
+            </w:tcBorders>
+            <w:shd w:fill="ffffff" w:color="auto" w:val="clear"/>
+            <w:tcMar>
+              <w:top w:type="dxa" w:w="170"/>
+              <w:left w:type="dxa" w:w="170"/>
+              <w:bottom w:type="dxa" w:w="170"/>
+              <w:right w:type="dxa" w:w="170"/>
+            </w:tcMar>
+            <w:vAlign w:val="center"/>
+          </w:tcPr>
+          <w:p>
+            <w:pPr>
+              <w:jc w:val="left"/>
+            </w:pPr>
+            <w:r>
+              <w:rPr>
+                <w:rFonts w:ascii="NanumGothic" w:cs="NanumGothic" w:eastAsia="NanumGothic" w:hAnsi="NanumGothic"/>
+                <w:sz w:val="20"/>
+                <w:szCs w:val="20"/>
+              </w:rPr>
+              <w:t xml:space="preserve"/>
+            </w:r>
+          </w:p>
+        </w:tc>
+        <w:tc>
+          <w:tcPr>
+            <w:tcW w:type="dxa" w:w="1814"/>
+            <w:tcBorders>
+              <w:top w:val="single" w:color="000000" w:sz="4"/>
+              <w:left w:val="single" w:color="000000" w:sz="4"/>
+              <w:bottom w:val="single" w:color="000000" w:sz="4"/>
+              <w:right w:val="single" w:color="000000" w:sz="4"/>
+            </w:tcBorders>
+            <w:shd w:fill="ffffff" w:color="auto" w:val="clear"/>
+            <w:tcMar>
+              <w:top w:type="dxa" w:w="170"/>
+              <w:left w:type="dxa" w:w="170"/>
+              <w:bottom w:type="dxa" w:w="170"/>
+              <w:right w:type="dxa" w:w="170"/>
+            </w:tcMar>
+            <w:vAlign w:val="center"/>
+          </w:tcPr>
+          <w:p>
+            <w:pPr>
+              <w:jc w:val="left"/>
+            </w:pPr>
+            <w:r>
+              <w:rPr>
+                <w:rFonts w:ascii="NanumGothic" w:cs="NanumGothic" w:eastAsia="NanumGothic" w:hAnsi="NanumGothic"/>
+                <w:sz w:val="20"/>
+                <w:szCs w:val="20"/>
+              </w:rPr>
+              <w:t xml:space="preserve"/>
+            </w:r>
+          </w:p>
+        </w:tc>
+        <w:tc>
+          <w:tcPr>
+            <w:tcW w:type="dxa" w:w="1814"/>
+            <w:tcBorders>
+              <w:top w:val="single" w:color="000000" w:sz="4"/>
+              <w:left w:val="single" w:color="000000" w:sz="4"/>
+              <w:bottom w:val="single" w:color="000000" w:sz="4"/>
+              <w:right w:val="single" w:color="000000" w:sz="4"/>
+            </w:tcBorders>
+            <w:shd w:fill="ffffff" w:color="auto" w:val="clear"/>
+            <w:tcMar>
+              <w:top w:type="dxa" w:w="170"/>
+              <w:left w:type="dxa" w:w="170"/>
+              <w:bottom w:type="dxa" w:w="170"/>
+              <w:right w:type="dxa" w:w="170"/>
+            </w:tcMar>
+            <w:vAlign w:val="center"/>
+          </w:tcPr>
+          <w:p>
+            <w:pPr>
+              <w:jc w:val="left"/>
+            </w:pPr>
+            <w:r>
+              <w:rPr>
+                <w:rFonts w:ascii="NanumGothic" w:cs="NanumGothic" w:eastAsia="NanumGothic" w:hAnsi="NanumGothic"/>
+                <w:sz w:val="20"/>
+                <w:szCs w:val="20"/>
+              </w:rPr>
+              <w:t xml:space="preserve"/>
+            </w:r>
+          </w:p>
+        </w:tc>
+        <w:tc>
+          <w:tcPr>
+            <w:tcW w:type="dxa" w:w="1077"/>
             <w:tcBorders>
               <w:top w:val="single" w:color="000000" w:sz="4"/>
               <w:left w:val="single" w:color="000000" w:sz="4"/>
@@ -1450,7 +1712,7 @@
         </w:trPr>
         <w:tc>
           <w:tcPr>
-            <w:tcW w:type="dxa" w:w="2154"/>
+            <w:tcW w:type="dxa" w:w="1700"/>
             <w:tcBorders>
               <w:top w:val="single" w:color="000000" w:sz="4"/>
               <w:left w:val="single" w:color="000000" w:sz="4"/>
@@ -1482,7 +1744,7 @@
         </w:tc>
         <w:tc>
           <w:tcPr>
-            <w:tcW w:type="dxa" w:w="1587"/>
+            <w:tcW w:type="dxa" w:w="1133"/>
             <w:tcBorders>
               <w:top w:val="single" w:color="000000" w:sz="4"/>
               <w:left w:val="single" w:color="000000" w:sz="4"/>
@@ -1514,7 +1776,7 @@
         </w:tc>
         <w:tc>
           <w:tcPr>
-            <w:tcW w:type="dxa" w:w="907"/>
+            <w:tcW w:type="dxa" w:w="1360"/>
             <w:tcBorders>
               <w:top w:val="single" w:color="000000" w:sz="4"/>
               <w:left w:val="single" w:color="000000" w:sz="4"/>
@@ -1546,7 +1808,7 @@
         </w:tc>
         <w:tc>
           <w:tcPr>
-            <w:tcW w:type="dxa" w:w="1360"/>
+            <w:tcW w:type="dxa" w:w="1247"/>
             <w:tcBorders>
               <w:top w:val="single" w:color="000000" w:sz="4"/>
               <w:left w:val="single" w:color="000000" w:sz="4"/>
@@ -1578,7 +1840,7 @@
         </w:tc>
         <w:tc>
           <w:tcPr>
-            <w:tcW w:type="dxa" w:w="1360"/>
+            <w:tcW w:type="dxa" w:w="793"/>
             <w:tcBorders>
               <w:top w:val="single" w:color="000000" w:sz="4"/>
               <w:left w:val="single" w:color="000000" w:sz="4"/>
@@ -1610,7 +1872,7 @@
         </w:tc>
         <w:tc>
           <w:tcPr>
-            <w:tcW w:type="dxa" w:w="1360"/>
+            <w:tcW w:type="dxa" w:w="1247"/>
             <w:tcBorders>
               <w:top w:val="single" w:color="000000" w:sz="4"/>
               <w:left w:val="single" w:color="000000" w:sz="4"/>
@@ -1642,7 +1904,7 @@
         </w:tc>
         <w:tc>
           <w:tcPr>
-            <w:tcW w:type="dxa" w:w="2267"/>
+            <w:tcW w:type="dxa" w:w="1247"/>
             <w:tcBorders>
               <w:top w:val="single" w:color="000000" w:sz="4"/>
               <w:left w:val="single" w:color="000000" w:sz="4"/>
@@ -1674,7 +1936,7 @@
         </w:tc>
         <w:tc>
           <w:tcPr>
-            <w:tcW w:type="dxa" w:w="2267"/>
+            <w:tcW w:type="dxa" w:w="1133"/>
             <w:tcBorders>
               <w:top w:val="single" w:color="000000" w:sz="4"/>
               <w:left w:val="single" w:color="000000" w:sz="4"/>
@@ -1706,7 +1968,71 @@
         </w:tc>
         <w:tc>
           <w:tcPr>
-            <w:tcW w:type="dxa" w:w="1303"/>
+            <w:tcW w:type="dxa" w:w="1814"/>
+            <w:tcBorders>
+              <w:top w:val="single" w:color="000000" w:sz="4"/>
+              <w:left w:val="single" w:color="000000" w:sz="4"/>
+              <w:bottom w:val="single" w:color="000000" w:sz="4"/>
+              <w:right w:val="single" w:color="000000" w:sz="4"/>
+            </w:tcBorders>
+            <w:shd w:fill="F5F5F5" w:color="auto" w:val="clear"/>
+            <w:tcMar>
+              <w:top w:type="dxa" w:w="170"/>
+              <w:left w:type="dxa" w:w="170"/>
+              <w:bottom w:type="dxa" w:w="170"/>
+              <w:right w:type="dxa" w:w="170"/>
+            </w:tcMar>
+            <w:vAlign w:val="center"/>
+          </w:tcPr>
+          <w:p>
+            <w:pPr>
+              <w:jc w:val="left"/>
+            </w:pPr>
+            <w:r>
+              <w:rPr>
+                <w:rFonts w:ascii="NanumGothic" w:cs="NanumGothic" w:eastAsia="NanumGothic" w:hAnsi="NanumGothic"/>
+                <w:sz w:val="20"/>
+                <w:szCs w:val="20"/>
+              </w:rPr>
+              <w:t xml:space="preserve"/>
+            </w:r>
+          </w:p>
+        </w:tc>
+        <w:tc>
+          <w:tcPr>
+            <w:tcW w:type="dxa" w:w="1814"/>
+            <w:tcBorders>
+              <w:top w:val="single" w:color="000000" w:sz="4"/>
+              <w:left w:val="single" w:color="000000" w:sz="4"/>
+              <w:bottom w:val="single" w:color="000000" w:sz="4"/>
+              <w:right w:val="single" w:color="000000" w:sz="4"/>
+            </w:tcBorders>
+            <w:shd w:fill="F5F5F5" w:color="auto" w:val="clear"/>
+            <w:tcMar>
+              <w:top w:type="dxa" w:w="170"/>
+              <w:left w:type="dxa" w:w="170"/>
+              <w:bottom w:type="dxa" w:w="170"/>
+              <w:right w:type="dxa" w:w="170"/>
+            </w:tcMar>
+            <w:vAlign w:val="center"/>
+          </w:tcPr>
+          <w:p>
+            <w:pPr>
+              <w:jc w:val="left"/>
+            </w:pPr>
+            <w:r>
+              <w:rPr>
+                <w:rFonts w:ascii="NanumGothic" w:cs="NanumGothic" w:eastAsia="NanumGothic" w:hAnsi="NanumGothic"/>
+                <w:sz w:val="20"/>
+                <w:szCs w:val="20"/>
+              </w:rPr>
+              <w:t xml:space="preserve"/>
+            </w:r>
+          </w:p>
+        </w:tc>
+        <w:tc>
+          <w:tcPr>
+            <w:tcW w:type="dxa" w:w="1077"/>
             <w:tcBorders>
               <w:top w:val="single" w:color="000000" w:sz="4"/>
               <w:left w:val="single" w:color="000000" w:sz="4"/>
@@ -1743,71 +2069,39 @@
         </w:trPr>
         <w:tc>
           <w:tcPr>
-            <w:tcW w:type="dxa" w:w="2154"/>
-            <w:tcBorders>
-              <w:top w:val="single" w:color="000000" w:sz="4"/>
-              <w:left w:val="single" w:color="000000" w:sz="4"/>
-              <w:bottom w:val="single" w:color="000000" w:sz="4"/>
-              <w:right w:val="single" w:color="000000" w:sz="4"/>
-            </w:tcBorders>
-            <w:shd w:fill="ffffff" w:color="auto" w:val="clear"/>
-            <w:tcMar>
-              <w:top w:type="dxa" w:w="170"/>
-              <w:left w:type="dxa" w:w="170"/>
-              <w:bottom w:type="dxa" w:w="170"/>
-              <w:right w:type="dxa" w:w="170"/>
-            </w:tcMar>
-            <w:vAlign w:val="center"/>
-          </w:tcPr>
-          <w:p>
-            <w:pPr>
-              <w:jc w:val="left"/>
-            </w:pPr>
-            <w:r>
-              <w:rPr>
-                <w:rFonts w:ascii="NanumGothic" w:cs="NanumGothic" w:eastAsia="NanumGothic" w:hAnsi="NanumGothic"/>
-                <w:sz w:val="20"/>
-                <w:szCs w:val="20"/>
-              </w:rPr>
-              <w:t xml:space="preserve"/>
-            </w:r>
-          </w:p>
-        </w:tc>
-        <w:tc>
-          <w:tcPr>
-            <w:tcW w:type="dxa" w:w="1587"/>
-            <w:tcBorders>
-              <w:top w:val="single" w:color="000000" w:sz="4"/>
-              <w:left w:val="single" w:color="000000" w:sz="4"/>
-              <w:bottom w:val="single" w:color="000000" w:sz="4"/>
-              <w:right w:val="single" w:color="000000" w:sz="4"/>
-            </w:tcBorders>
-            <w:shd w:fill="ffffff" w:color="auto" w:val="clear"/>
-            <w:tcMar>
-              <w:top w:type="dxa" w:w="170"/>
-              <w:left w:type="dxa" w:w="170"/>
-              <w:bottom w:type="dxa" w:w="170"/>
-              <w:right w:type="dxa" w:w="170"/>
-            </w:tcMar>
-            <w:vAlign w:val="center"/>
-          </w:tcPr>
-          <w:p>
-            <w:pPr>
-              <w:jc w:val="left"/>
-            </w:pPr>
-            <w:r>
-              <w:rPr>
-                <w:rFonts w:ascii="NanumGothic" w:cs="NanumGothic" w:eastAsia="NanumGothic" w:hAnsi="NanumGothic"/>
-                <w:sz w:val="20"/>
-                <w:szCs w:val="20"/>
-              </w:rPr>
-              <w:t xml:space="preserve"/>
-            </w:r>
-          </w:p>
-        </w:tc>
-        <w:tc>
-          <w:tcPr>
-            <w:tcW w:type="dxa" w:w="907"/>
+            <w:tcW w:type="dxa" w:w="1700"/>
+            <w:tcBorders>
+              <w:top w:val="single" w:color="000000" w:sz="4"/>
+              <w:left w:val="single" w:color="000000" w:sz="4"/>
+              <w:bottom w:val="single" w:color="000000" w:sz="4"/>
+              <w:right w:val="single" w:color="000000" w:sz="4"/>
+            </w:tcBorders>
+            <w:shd w:fill="ffffff" w:color="auto" w:val="clear"/>
+            <w:tcMar>
+              <w:top w:type="dxa" w:w="170"/>
+              <w:left w:type="dxa" w:w="170"/>
+              <w:bottom w:type="dxa" w:w="170"/>
+              <w:right w:type="dxa" w:w="170"/>
+            </w:tcMar>
+            <w:vAlign w:val="center"/>
+          </w:tcPr>
+          <w:p>
+            <w:pPr>
+              <w:jc w:val="left"/>
+            </w:pPr>
+            <w:r>
+              <w:rPr>
+                <w:rFonts w:ascii="NanumGothic" w:cs="NanumGothic" w:eastAsia="NanumGothic" w:hAnsi="NanumGothic"/>
+                <w:sz w:val="20"/>
+                <w:szCs w:val="20"/>
+              </w:rPr>
+              <w:t xml:space="preserve"/>
+            </w:r>
+          </w:p>
+        </w:tc>
+        <w:tc>
+          <w:tcPr>
+            <w:tcW w:type="dxa" w:w="1133"/>
             <w:tcBorders>
               <w:top w:val="single" w:color="000000" w:sz="4"/>
               <w:left w:val="single" w:color="000000" w:sz="4"/>
@@ -1871,135 +2165,231 @@
         </w:tc>
         <w:tc>
           <w:tcPr>
-            <w:tcW w:type="dxa" w:w="1360"/>
-            <w:tcBorders>
-              <w:top w:val="single" w:color="000000" w:sz="4"/>
-              <w:left w:val="single" w:color="000000" w:sz="4"/>
-              <w:bottom w:val="single" w:color="000000" w:sz="4"/>
-              <w:right w:val="single" w:color="000000" w:sz="4"/>
-            </w:tcBorders>
-            <w:shd w:fill="ffffff" w:color="auto" w:val="clear"/>
-            <w:tcMar>
-              <w:top w:type="dxa" w:w="170"/>
-              <w:left w:type="dxa" w:w="170"/>
-              <w:bottom w:type="dxa" w:w="170"/>
-              <w:right w:type="dxa" w:w="170"/>
-            </w:tcMar>
-            <w:vAlign w:val="center"/>
-          </w:tcPr>
-          <w:p>
-            <w:pPr>
-              <w:jc w:val="left"/>
-            </w:pPr>
-            <w:r>
-              <w:rPr>
-                <w:rFonts w:ascii="NanumGothic" w:cs="NanumGothic" w:eastAsia="NanumGothic" w:hAnsi="NanumGothic"/>
-                <w:sz w:val="20"/>
-                <w:szCs w:val="20"/>
-              </w:rPr>
-              <w:t xml:space="preserve"/>
-            </w:r>
-          </w:p>
-        </w:tc>
-        <w:tc>
-          <w:tcPr>
-            <w:tcW w:type="dxa" w:w="1360"/>
-            <w:tcBorders>
-              <w:top w:val="single" w:color="000000" w:sz="4"/>
-              <w:left w:val="single" w:color="000000" w:sz="4"/>
-              <w:bottom w:val="single" w:color="000000" w:sz="4"/>
-              <w:right w:val="single" w:color="000000" w:sz="4"/>
-            </w:tcBorders>
-            <w:shd w:fill="ffffff" w:color="auto" w:val="clear"/>
-            <w:tcMar>
-              <w:top w:type="dxa" w:w="170"/>
-              <w:left w:type="dxa" w:w="170"/>
-              <w:bottom w:type="dxa" w:w="170"/>
-              <w:right w:type="dxa" w:w="170"/>
-            </w:tcMar>
-            <w:vAlign w:val="center"/>
-          </w:tcPr>
-          <w:p>
-            <w:pPr>
-              <w:jc w:val="left"/>
-            </w:pPr>
-            <w:r>
-              <w:rPr>
-                <w:rFonts w:ascii="NanumGothic" w:cs="NanumGothic" w:eastAsia="NanumGothic" w:hAnsi="NanumGothic"/>
-                <w:sz w:val="20"/>
-                <w:szCs w:val="20"/>
-              </w:rPr>
-              <w:t xml:space="preserve"/>
-            </w:r>
-          </w:p>
-        </w:tc>
-        <w:tc>
-          <w:tcPr>
-            <w:tcW w:type="dxa" w:w="2267"/>
-            <w:tcBorders>
-              <w:top w:val="single" w:color="000000" w:sz="4"/>
-              <w:left w:val="single" w:color="000000" w:sz="4"/>
-              <w:bottom w:val="single" w:color="000000" w:sz="4"/>
-              <w:right w:val="single" w:color="000000" w:sz="4"/>
-            </w:tcBorders>
-            <w:shd w:fill="ffffff" w:color="auto" w:val="clear"/>
-            <w:tcMar>
-              <w:top w:type="dxa" w:w="170"/>
-              <w:left w:type="dxa" w:w="170"/>
-              <w:bottom w:type="dxa" w:w="170"/>
-              <w:right w:type="dxa" w:w="170"/>
-            </w:tcMar>
-            <w:vAlign w:val="center"/>
-          </w:tcPr>
-          <w:p>
-            <w:pPr>
-              <w:jc w:val="left"/>
-            </w:pPr>
-            <w:r>
-              <w:rPr>
-                <w:rFonts w:ascii="NanumGothic" w:cs="NanumGothic" w:eastAsia="NanumGothic" w:hAnsi="NanumGothic"/>
-                <w:sz w:val="20"/>
-                <w:szCs w:val="20"/>
-              </w:rPr>
-              <w:t xml:space="preserve"/>
-            </w:r>
-          </w:p>
-        </w:tc>
-        <w:tc>
-          <w:tcPr>
-            <w:tcW w:type="dxa" w:w="2267"/>
-            <w:tcBorders>
-              <w:top w:val="single" w:color="000000" w:sz="4"/>
-              <w:left w:val="single" w:color="000000" w:sz="4"/>
-              <w:bottom w:val="single" w:color="000000" w:sz="4"/>
-              <w:right w:val="single" w:color="000000" w:sz="4"/>
-            </w:tcBorders>
-            <w:shd w:fill="ffffff" w:color="auto" w:val="clear"/>
-            <w:tcMar>
-              <w:top w:type="dxa" w:w="170"/>
-              <w:left w:type="dxa" w:w="170"/>
-              <w:bottom w:type="dxa" w:w="170"/>
-              <w:right w:type="dxa" w:w="170"/>
-            </w:tcMar>
-            <w:vAlign w:val="center"/>
-          </w:tcPr>
-          <w:p>
-            <w:pPr>
-              <w:jc w:val="left"/>
-            </w:pPr>
-            <w:r>
-              <w:rPr>
-                <w:rFonts w:ascii="NanumGothic" w:cs="NanumGothic" w:eastAsia="NanumGothic" w:hAnsi="NanumGothic"/>
-                <w:sz w:val="20"/>
-                <w:szCs w:val="20"/>
-              </w:rPr>
-              <w:t xml:space="preserve"/>
-            </w:r>
-          </w:p>
-        </w:tc>
-        <w:tc>
-          <w:tcPr>
-            <w:tcW w:type="dxa" w:w="1303"/>
+            <w:tcW w:type="dxa" w:w="1247"/>
+            <w:tcBorders>
+              <w:top w:val="single" w:color="000000" w:sz="4"/>
+              <w:left w:val="single" w:color="000000" w:sz="4"/>
+              <w:bottom w:val="single" w:color="000000" w:sz="4"/>
+              <w:right w:val="single" w:color="000000" w:sz="4"/>
+            </w:tcBorders>
+            <w:shd w:fill="ffffff" w:color="auto" w:val="clear"/>
+            <w:tcMar>
+              <w:top w:type="dxa" w:w="170"/>
+              <w:left w:type="dxa" w:w="170"/>
+              <w:bottom w:type="dxa" w:w="170"/>
+              <w:right w:type="dxa" w:w="170"/>
+            </w:tcMar>
+            <w:vAlign w:val="center"/>
+          </w:tcPr>
+          <w:p>
+            <w:pPr>
+              <w:jc w:val="left"/>
+            </w:pPr>
+            <w:r>
+              <w:rPr>
+                <w:rFonts w:ascii="NanumGothic" w:cs="NanumGothic" w:eastAsia="NanumGothic" w:hAnsi="NanumGothic"/>
+                <w:sz w:val="20"/>
+                <w:szCs w:val="20"/>
+              </w:rPr>
+              <w:t xml:space="preserve"/>
+            </w:r>
+          </w:p>
+        </w:tc>
+        <w:tc>
+          <w:tcPr>
+            <w:tcW w:type="dxa" w:w="793"/>
+            <w:tcBorders>
+              <w:top w:val="single" w:color="000000" w:sz="4"/>
+              <w:left w:val="single" w:color="000000" w:sz="4"/>
+              <w:bottom w:val="single" w:color="000000" w:sz="4"/>
+              <w:right w:val="single" w:color="000000" w:sz="4"/>
+            </w:tcBorders>
+            <w:shd w:fill="ffffff" w:color="auto" w:val="clear"/>
+            <w:tcMar>
+              <w:top w:type="dxa" w:w="170"/>
+              <w:left w:type="dxa" w:w="170"/>
+              <w:bottom w:type="dxa" w:w="170"/>
+              <w:right w:type="dxa" w:w="170"/>
+            </w:tcMar>
+            <w:vAlign w:val="center"/>
+          </w:tcPr>
+          <w:p>
+            <w:pPr>
+              <w:jc w:val="left"/>
+            </w:pPr>
+            <w:r>
+              <w:rPr>
+                <w:rFonts w:ascii="NanumGothic" w:cs="NanumGothic" w:eastAsia="NanumGothic" w:hAnsi="NanumGothic"/>
+                <w:sz w:val="20"/>
+                <w:szCs w:val="20"/>
+              </w:rPr>
+              <w:t xml:space="preserve"/>
+            </w:r>
+          </w:p>
+        </w:tc>
+        <w:tc>
+          <w:tcPr>
+            <w:tcW w:type="dxa" w:w="1247"/>
+            <w:tcBorders>
+              <w:top w:val="single" w:color="000000" w:sz="4"/>
+              <w:left w:val="single" w:color="000000" w:sz="4"/>
+              <w:bottom w:val="single" w:color="000000" w:sz="4"/>
+              <w:right w:val="single" w:color="000000" w:sz="4"/>
+            </w:tcBorders>
+            <w:shd w:fill="ffffff" w:color="auto" w:val="clear"/>
+            <w:tcMar>
+              <w:top w:type="dxa" w:w="170"/>
+              <w:left w:type="dxa" w:w="170"/>
+              <w:bottom w:type="dxa" w:w="170"/>
+              <w:right w:type="dxa" w:w="170"/>
+            </w:tcMar>
+            <w:vAlign w:val="center"/>
+          </w:tcPr>
+          <w:p>
+            <w:pPr>
+              <w:jc w:val="left"/>
+            </w:pPr>
+            <w:r>
+              <w:rPr>
+                <w:rFonts w:ascii="NanumGothic" w:cs="NanumGothic" w:eastAsia="NanumGothic" w:hAnsi="NanumGothic"/>
+                <w:sz w:val="20"/>
+                <w:szCs w:val="20"/>
+              </w:rPr>
+              <w:t xml:space="preserve"/>
+            </w:r>
+          </w:p>
+        </w:tc>
+        <w:tc>
+          <w:tcPr>
+            <w:tcW w:type="dxa" w:w="1247"/>
+            <w:tcBorders>
+              <w:top w:val="single" w:color="000000" w:sz="4"/>
+              <w:left w:val="single" w:color="000000" w:sz="4"/>
+              <w:bottom w:val="single" w:color="000000" w:sz="4"/>
+              <w:right w:val="single" w:color="000000" w:sz="4"/>
+            </w:tcBorders>
+            <w:shd w:fill="ffffff" w:color="auto" w:val="clear"/>
+            <w:tcMar>
+              <w:top w:type="dxa" w:w="170"/>
+              <w:left w:type="dxa" w:w="170"/>
+              <w:bottom w:type="dxa" w:w="170"/>
+              <w:right w:type="dxa" w:w="170"/>
+            </w:tcMar>
+            <w:vAlign w:val="center"/>
+          </w:tcPr>
+          <w:p>
+            <w:pPr>
+              <w:jc w:val="left"/>
+            </w:pPr>
+            <w:r>
+              <w:rPr>
+                <w:rFonts w:ascii="NanumGothic" w:cs="NanumGothic" w:eastAsia="NanumGothic" w:hAnsi="NanumGothic"/>
+                <w:sz w:val="20"/>
+                <w:szCs w:val="20"/>
+              </w:rPr>
+              <w:t xml:space="preserve"/>
+            </w:r>
+          </w:p>
+        </w:tc>
+        <w:tc>
+          <w:tcPr>
+            <w:tcW w:type="dxa" w:w="1133"/>
+            <w:tcBorders>
+              <w:top w:val="single" w:color="000000" w:sz="4"/>
+              <w:left w:val="single" w:color="000000" w:sz="4"/>
+              <w:bottom w:val="single" w:color="000000" w:sz="4"/>
+              <w:right w:val="single" w:color="000000" w:sz="4"/>
+            </w:tcBorders>
+            <w:shd w:fill="ffffff" w:color="auto" w:val="clear"/>
+            <w:tcMar>
+              <w:top w:type="dxa" w:w="170"/>
+              <w:left w:type="dxa" w:w="170"/>
+              <w:bottom w:type="dxa" w:w="170"/>
+              <w:right w:type="dxa" w:w="170"/>
+            </w:tcMar>
+            <w:vAlign w:val="center"/>
+          </w:tcPr>
+          <w:p>
+            <w:pPr>
+              <w:jc w:val="left"/>
+            </w:pPr>
+            <w:r>
+              <w:rPr>
+                <w:rFonts w:ascii="NanumGothic" w:cs="NanumGothic" w:eastAsia="NanumGothic" w:hAnsi="NanumGothic"/>
+                <w:sz w:val="20"/>
+                <w:szCs w:val="20"/>
+              </w:rPr>
+              <w:t xml:space="preserve"/>
+            </w:r>
+          </w:p>
+        </w:tc>
+        <w:tc>
+          <w:tcPr>
+            <w:tcW w:type="dxa" w:w="1814"/>
+            <w:tcBorders>
+              <w:top w:val="single" w:color="000000" w:sz="4"/>
+              <w:left w:val="single" w:color="000000" w:sz="4"/>
+              <w:bottom w:val="single" w:color="000000" w:sz="4"/>
+              <w:right w:val="single" w:color="000000" w:sz="4"/>
+            </w:tcBorders>
+            <w:shd w:fill="ffffff" w:color="auto" w:val="clear"/>
+            <w:tcMar>
+              <w:top w:type="dxa" w:w="170"/>
+              <w:left w:type="dxa" w:w="170"/>
+              <w:bottom w:type="dxa" w:w="170"/>
+              <w:right w:type="dxa" w:w="170"/>
+            </w:tcMar>
+            <w:vAlign w:val="center"/>
+          </w:tcPr>
+          <w:p>
+            <w:pPr>
+              <w:jc w:val="left"/>
+            </w:pPr>
+            <w:r>
+              <w:rPr>
+                <w:rFonts w:ascii="NanumGothic" w:cs="NanumGothic" w:eastAsia="NanumGothic" w:hAnsi="NanumGothic"/>
+                <w:sz w:val="20"/>
+                <w:szCs w:val="20"/>
+              </w:rPr>
+              <w:t xml:space="preserve"/>
+            </w:r>
+          </w:p>
+        </w:tc>
+        <w:tc>
+          <w:tcPr>
+            <w:tcW w:type="dxa" w:w="1814"/>
+            <w:tcBorders>
+              <w:top w:val="single" w:color="000000" w:sz="4"/>
+              <w:left w:val="single" w:color="000000" w:sz="4"/>
+              <w:bottom w:val="single" w:color="000000" w:sz="4"/>
+              <w:right w:val="single" w:color="000000" w:sz="4"/>
+            </w:tcBorders>
+            <w:shd w:fill="ffffff" w:color="auto" w:val="clear"/>
+            <w:tcMar>
+              <w:top w:type="dxa" w:w="170"/>
+              <w:left w:type="dxa" w:w="170"/>
+              <w:bottom w:type="dxa" w:w="170"/>
+              <w:right w:type="dxa" w:w="170"/>
+            </w:tcMar>
+            <w:vAlign w:val="center"/>
+          </w:tcPr>
+          <w:p>
+            <w:pPr>
+              <w:jc w:val="left"/>
+            </w:pPr>
+            <w:r>
+              <w:rPr>
+                <w:rFonts w:ascii="NanumGothic" w:cs="NanumGothic" w:eastAsia="NanumGothic" w:hAnsi="NanumGothic"/>
+                <w:sz w:val="20"/>
+                <w:szCs w:val="20"/>
+              </w:rPr>
+              <w:t xml:space="preserve"/>
+            </w:r>
+          </w:p>
+        </w:tc>
+        <w:tc>
+          <w:tcPr>
+            <w:tcW w:type="dxa" w:w="1077"/>
             <w:tcBorders>
               <w:top w:val="single" w:color="000000" w:sz="4"/>
               <w:left w:val="single" w:color="000000" w:sz="4"/>
@@ -2036,7 +2426,7 @@
         </w:trPr>
         <w:tc>
           <w:tcPr>
-            <w:tcW w:type="dxa" w:w="2154"/>
+            <w:tcW w:type="dxa" w:w="1700"/>
             <w:tcBorders>
               <w:top w:val="single" w:color="000000" w:sz="4"/>
               <w:left w:val="single" w:color="000000" w:sz="4"/>
@@ -2068,7 +2458,7 @@
         </w:tc>
         <w:tc>
           <w:tcPr>
-            <w:tcW w:type="dxa" w:w="1587"/>
+            <w:tcW w:type="dxa" w:w="1133"/>
             <w:tcBorders>
               <w:top w:val="single" w:color="000000" w:sz="4"/>
               <w:left w:val="single" w:color="000000" w:sz="4"/>
@@ -2100,7 +2490,7 @@
         </w:tc>
         <w:tc>
           <w:tcPr>
-            <w:tcW w:type="dxa" w:w="907"/>
+            <w:tcW w:type="dxa" w:w="1360"/>
             <w:tcBorders>
               <w:top w:val="single" w:color="000000" w:sz="4"/>
               <w:left w:val="single" w:color="000000" w:sz="4"/>
@@ -2132,7 +2522,7 @@
         </w:tc>
         <w:tc>
           <w:tcPr>
-            <w:tcW w:type="dxa" w:w="1360"/>
+            <w:tcW w:type="dxa" w:w="1247"/>
             <w:tcBorders>
               <w:top w:val="single" w:color="000000" w:sz="4"/>
               <w:left w:val="single" w:color="000000" w:sz="4"/>
@@ -2164,7 +2554,7 @@
         </w:tc>
         <w:tc>
           <w:tcPr>
-            <w:tcW w:type="dxa" w:w="1360"/>
+            <w:tcW w:type="dxa" w:w="793"/>
             <w:tcBorders>
               <w:top w:val="single" w:color="000000" w:sz="4"/>
               <w:left w:val="single" w:color="000000" w:sz="4"/>
@@ -2196,7 +2586,7 @@
         </w:tc>
         <w:tc>
           <w:tcPr>
-            <w:tcW w:type="dxa" w:w="1360"/>
+            <w:tcW w:type="dxa" w:w="1247"/>
             <w:tcBorders>
               <w:top w:val="single" w:color="000000" w:sz="4"/>
               <w:left w:val="single" w:color="000000" w:sz="4"/>
@@ -2228,7 +2618,7 @@
         </w:tc>
         <w:tc>
           <w:tcPr>
-            <w:tcW w:type="dxa" w:w="2267"/>
+            <w:tcW w:type="dxa" w:w="1247"/>
             <w:tcBorders>
               <w:top w:val="single" w:color="000000" w:sz="4"/>
               <w:left w:val="single" w:color="000000" w:sz="4"/>
@@ -2260,7 +2650,7 @@
         </w:tc>
         <w:tc>
           <w:tcPr>
-            <w:tcW w:type="dxa" w:w="2267"/>
+            <w:tcW w:type="dxa" w:w="1133"/>
             <w:tcBorders>
               <w:top w:val="single" w:color="000000" w:sz="4"/>
               <w:left w:val="single" w:color="000000" w:sz="4"/>
@@ -2292,7 +2682,71 @@
         </w:tc>
         <w:tc>
           <w:tcPr>
-            <w:tcW w:type="dxa" w:w="1303"/>
+            <w:tcW w:type="dxa" w:w="1814"/>
+            <w:tcBorders>
+              <w:top w:val="single" w:color="000000" w:sz="4"/>
+              <w:left w:val="single" w:color="000000" w:sz="4"/>
+              <w:bottom w:val="single" w:color="000000" w:sz="4"/>
+              <w:right w:val="single" w:color="000000" w:sz="4"/>
+            </w:tcBorders>
+            <w:shd w:fill="F5F5F5" w:color="auto" w:val="clear"/>
+            <w:tcMar>
+              <w:top w:type="dxa" w:w="170"/>
+              <w:left w:type="dxa" w:w="170"/>
+              <w:bottom w:type="dxa" w:w="170"/>
+              <w:right w:type="dxa" w:w="170"/>
+            </w:tcMar>
+            <w:vAlign w:val="center"/>
+          </w:tcPr>
+          <w:p>
+            <w:pPr>
+              <w:jc w:val="left"/>
+            </w:pPr>
+            <w:r>
+              <w:rPr>
+                <w:rFonts w:ascii="NanumGothic" w:cs="NanumGothic" w:eastAsia="NanumGothic" w:hAnsi="NanumGothic"/>
+                <w:sz w:val="20"/>
+                <w:szCs w:val="20"/>
+              </w:rPr>
+              <w:t xml:space="preserve"/>
+            </w:r>
+          </w:p>
+        </w:tc>
+        <w:tc>
+          <w:tcPr>
+            <w:tcW w:type="dxa" w:w="1814"/>
+            <w:tcBorders>
+              <w:top w:val="single" w:color="000000" w:sz="4"/>
+              <w:left w:val="single" w:color="000000" w:sz="4"/>
+              <w:bottom w:val="single" w:color="000000" w:sz="4"/>
+              <w:right w:val="single" w:color="000000" w:sz="4"/>
+            </w:tcBorders>
+            <w:shd w:fill="F5F5F5" w:color="auto" w:val="clear"/>
+            <w:tcMar>
+              <w:top w:type="dxa" w:w="170"/>
+              <w:left w:type="dxa" w:w="170"/>
+              <w:bottom w:type="dxa" w:w="170"/>
+              <w:right w:type="dxa" w:w="170"/>
+            </w:tcMar>
+            <w:vAlign w:val="center"/>
+          </w:tcPr>
+          <w:p>
+            <w:pPr>
+              <w:jc w:val="left"/>
+            </w:pPr>
+            <w:r>
+              <w:rPr>
+                <w:rFonts w:ascii="NanumGothic" w:cs="NanumGothic" w:eastAsia="NanumGothic" w:hAnsi="NanumGothic"/>
+                <w:sz w:val="20"/>
+                <w:szCs w:val="20"/>
+              </w:rPr>
+              <w:t xml:space="preserve"/>
+            </w:r>
+          </w:p>
+        </w:tc>
+        <w:tc>
+          <w:tcPr>
+            <w:tcW w:type="dxa" w:w="1077"/>
             <w:tcBorders>
               <w:top w:val="single" w:color="000000" w:sz="4"/>
               <w:left w:val="single" w:color="000000" w:sz="4"/>
@@ -2329,71 +2783,39 @@
         </w:trPr>
         <w:tc>
           <w:tcPr>
-            <w:tcW w:type="dxa" w:w="2154"/>
-            <w:tcBorders>
-              <w:top w:val="single" w:color="000000" w:sz="4"/>
-              <w:left w:val="single" w:color="000000" w:sz="4"/>
-              <w:bottom w:val="single" w:color="000000" w:sz="4"/>
-              <w:right w:val="single" w:color="000000" w:sz="4"/>
-            </w:tcBorders>
-            <w:shd w:fill="ffffff" w:color="auto" w:val="clear"/>
-            <w:tcMar>
-              <w:top w:type="dxa" w:w="170"/>
-              <w:left w:type="dxa" w:w="170"/>
-              <w:bottom w:type="dxa" w:w="170"/>
-              <w:right w:type="dxa" w:w="170"/>
-            </w:tcMar>
-            <w:vAlign w:val="center"/>
-          </w:tcPr>
-          <w:p>
-            <w:pPr>
-              <w:jc w:val="left"/>
-            </w:pPr>
-            <w:r>
-              <w:rPr>
-                <w:rFonts w:ascii="NanumGothic" w:cs="NanumGothic" w:eastAsia="NanumGothic" w:hAnsi="NanumGothic"/>
-                <w:sz w:val="20"/>
-                <w:szCs w:val="20"/>
-              </w:rPr>
-              <w:t xml:space="preserve"/>
-            </w:r>
-          </w:p>
-        </w:tc>
-        <w:tc>
-          <w:tcPr>
-            <w:tcW w:type="dxa" w:w="1587"/>
-            <w:tcBorders>
-              <w:top w:val="single" w:color="000000" w:sz="4"/>
-              <w:left w:val="single" w:color="000000" w:sz="4"/>
-              <w:bottom w:val="single" w:color="000000" w:sz="4"/>
-              <w:right w:val="single" w:color="000000" w:sz="4"/>
-            </w:tcBorders>
-            <w:shd w:fill="ffffff" w:color="auto" w:val="clear"/>
-            <w:tcMar>
-              <w:top w:type="dxa" w:w="170"/>
-              <w:left w:type="dxa" w:w="170"/>
-              <w:bottom w:type="dxa" w:w="170"/>
-              <w:right w:type="dxa" w:w="170"/>
-            </w:tcMar>
-            <w:vAlign w:val="center"/>
-          </w:tcPr>
-          <w:p>
-            <w:pPr>
-              <w:jc w:val="left"/>
-            </w:pPr>
-            <w:r>
-              <w:rPr>
-                <w:rFonts w:ascii="NanumGothic" w:cs="NanumGothic" w:eastAsia="NanumGothic" w:hAnsi="NanumGothic"/>
-                <w:sz w:val="20"/>
-                <w:szCs w:val="20"/>
-              </w:rPr>
-              <w:t xml:space="preserve"/>
-            </w:r>
-          </w:p>
-        </w:tc>
-        <w:tc>
-          <w:tcPr>
-            <w:tcW w:type="dxa" w:w="907"/>
+            <w:tcW w:type="dxa" w:w="1700"/>
+            <w:tcBorders>
+              <w:top w:val="single" w:color="000000" w:sz="4"/>
+              <w:left w:val="single" w:color="000000" w:sz="4"/>
+              <w:bottom w:val="single" w:color="000000" w:sz="4"/>
+              <w:right w:val="single" w:color="000000" w:sz="4"/>
+            </w:tcBorders>
+            <w:shd w:fill="ffffff" w:color="auto" w:val="clear"/>
+            <w:tcMar>
+              <w:top w:type="dxa" w:w="170"/>
+              <w:left w:type="dxa" w:w="170"/>
+              <w:bottom w:type="dxa" w:w="170"/>
+              <w:right w:type="dxa" w:w="170"/>
+            </w:tcMar>
+            <w:vAlign w:val="center"/>
+          </w:tcPr>
+          <w:p>
+            <w:pPr>
+              <w:jc w:val="left"/>
+            </w:pPr>
+            <w:r>
+              <w:rPr>
+                <w:rFonts w:ascii="NanumGothic" w:cs="NanumGothic" w:eastAsia="NanumGothic" w:hAnsi="NanumGothic"/>
+                <w:sz w:val="20"/>
+                <w:szCs w:val="20"/>
+              </w:rPr>
+              <w:t xml:space="preserve"/>
+            </w:r>
+          </w:p>
+        </w:tc>
+        <w:tc>
+          <w:tcPr>
+            <w:tcW w:type="dxa" w:w="1133"/>
             <w:tcBorders>
               <w:top w:val="single" w:color="000000" w:sz="4"/>
               <w:left w:val="single" w:color="000000" w:sz="4"/>
@@ -2457,135 +2879,231 @@
         </w:tc>
         <w:tc>
           <w:tcPr>
-            <w:tcW w:type="dxa" w:w="1360"/>
-            <w:tcBorders>
-              <w:top w:val="single" w:color="000000" w:sz="4"/>
-              <w:left w:val="single" w:color="000000" w:sz="4"/>
-              <w:bottom w:val="single" w:color="000000" w:sz="4"/>
-              <w:right w:val="single" w:color="000000" w:sz="4"/>
-            </w:tcBorders>
-            <w:shd w:fill="ffffff" w:color="auto" w:val="clear"/>
-            <w:tcMar>
-              <w:top w:type="dxa" w:w="170"/>
-              <w:left w:type="dxa" w:w="170"/>
-              <w:bottom w:type="dxa" w:w="170"/>
-              <w:right w:type="dxa" w:w="170"/>
-            </w:tcMar>
-            <w:vAlign w:val="center"/>
-          </w:tcPr>
-          <w:p>
-            <w:pPr>
-              <w:jc w:val="left"/>
-            </w:pPr>
-            <w:r>
-              <w:rPr>
-                <w:rFonts w:ascii="NanumGothic" w:cs="NanumGothic" w:eastAsia="NanumGothic" w:hAnsi="NanumGothic"/>
-                <w:sz w:val="20"/>
-                <w:szCs w:val="20"/>
-              </w:rPr>
-              <w:t xml:space="preserve"/>
-            </w:r>
-          </w:p>
-        </w:tc>
-        <w:tc>
-          <w:tcPr>
-            <w:tcW w:type="dxa" w:w="1360"/>
-            <w:tcBorders>
-              <w:top w:val="single" w:color="000000" w:sz="4"/>
-              <w:left w:val="single" w:color="000000" w:sz="4"/>
-              <w:bottom w:val="single" w:color="000000" w:sz="4"/>
-              <w:right w:val="single" w:color="000000" w:sz="4"/>
-            </w:tcBorders>
-            <w:shd w:fill="ffffff" w:color="auto" w:val="clear"/>
-            <w:tcMar>
-              <w:top w:type="dxa" w:w="170"/>
-              <w:left w:type="dxa" w:w="170"/>
-              <w:bottom w:type="dxa" w:w="170"/>
-              <w:right w:type="dxa" w:w="170"/>
-            </w:tcMar>
-            <w:vAlign w:val="center"/>
-          </w:tcPr>
-          <w:p>
-            <w:pPr>
-              <w:jc w:val="left"/>
-            </w:pPr>
-            <w:r>
-              <w:rPr>
-                <w:rFonts w:ascii="NanumGothic" w:cs="NanumGothic" w:eastAsia="NanumGothic" w:hAnsi="NanumGothic"/>
-                <w:sz w:val="20"/>
-                <w:szCs w:val="20"/>
-              </w:rPr>
-              <w:t xml:space="preserve"/>
-            </w:r>
-          </w:p>
-        </w:tc>
-        <w:tc>
-          <w:tcPr>
-            <w:tcW w:type="dxa" w:w="2267"/>
-            <w:tcBorders>
-              <w:top w:val="single" w:color="000000" w:sz="4"/>
-              <w:left w:val="single" w:color="000000" w:sz="4"/>
-              <w:bottom w:val="single" w:color="000000" w:sz="4"/>
-              <w:right w:val="single" w:color="000000" w:sz="4"/>
-            </w:tcBorders>
-            <w:shd w:fill="ffffff" w:color="auto" w:val="clear"/>
-            <w:tcMar>
-              <w:top w:type="dxa" w:w="170"/>
-              <w:left w:type="dxa" w:w="170"/>
-              <w:bottom w:type="dxa" w:w="170"/>
-              <w:right w:type="dxa" w:w="170"/>
-            </w:tcMar>
-            <w:vAlign w:val="center"/>
-          </w:tcPr>
-          <w:p>
-            <w:pPr>
-              <w:jc w:val="left"/>
-            </w:pPr>
-            <w:r>
-              <w:rPr>
-                <w:rFonts w:ascii="NanumGothic" w:cs="NanumGothic" w:eastAsia="NanumGothic" w:hAnsi="NanumGothic"/>
-                <w:sz w:val="20"/>
-                <w:szCs w:val="20"/>
-              </w:rPr>
-              <w:t xml:space="preserve"/>
-            </w:r>
-          </w:p>
-        </w:tc>
-        <w:tc>
-          <w:tcPr>
-            <w:tcW w:type="dxa" w:w="2267"/>
-            <w:tcBorders>
-              <w:top w:val="single" w:color="000000" w:sz="4"/>
-              <w:left w:val="single" w:color="000000" w:sz="4"/>
-              <w:bottom w:val="single" w:color="000000" w:sz="4"/>
-              <w:right w:val="single" w:color="000000" w:sz="4"/>
-            </w:tcBorders>
-            <w:shd w:fill="ffffff" w:color="auto" w:val="clear"/>
-            <w:tcMar>
-              <w:top w:type="dxa" w:w="170"/>
-              <w:left w:type="dxa" w:w="170"/>
-              <w:bottom w:type="dxa" w:w="170"/>
-              <w:right w:type="dxa" w:w="170"/>
-            </w:tcMar>
-            <w:vAlign w:val="center"/>
-          </w:tcPr>
-          <w:p>
-            <w:pPr>
-              <w:jc w:val="left"/>
-            </w:pPr>
-            <w:r>
-              <w:rPr>
-                <w:rFonts w:ascii="NanumGothic" w:cs="NanumGothic" w:eastAsia="NanumGothic" w:hAnsi="NanumGothic"/>
-                <w:sz w:val="20"/>
-                <w:szCs w:val="20"/>
-              </w:rPr>
-              <w:t xml:space="preserve"/>
-            </w:r>
-          </w:p>
-        </w:tc>
-        <w:tc>
-          <w:tcPr>
-            <w:tcW w:type="dxa" w:w="1303"/>
+            <w:tcW w:type="dxa" w:w="1247"/>
+            <w:tcBorders>
+              <w:top w:val="single" w:color="000000" w:sz="4"/>
+              <w:left w:val="single" w:color="000000" w:sz="4"/>
+              <w:bottom w:val="single" w:color="000000" w:sz="4"/>
+              <w:right w:val="single" w:color="000000" w:sz="4"/>
+            </w:tcBorders>
+            <w:shd w:fill="ffffff" w:color="auto" w:val="clear"/>
+            <w:tcMar>
+              <w:top w:type="dxa" w:w="170"/>
+              <w:left w:type="dxa" w:w="170"/>
+              <w:bottom w:type="dxa" w:w="170"/>
+              <w:right w:type="dxa" w:w="170"/>
+            </w:tcMar>
+            <w:vAlign w:val="center"/>
+          </w:tcPr>
+          <w:p>
+            <w:pPr>
+              <w:jc w:val="left"/>
+            </w:pPr>
+            <w:r>
+              <w:rPr>
+                <w:rFonts w:ascii="NanumGothic" w:cs="NanumGothic" w:eastAsia="NanumGothic" w:hAnsi="NanumGothic"/>
+                <w:sz w:val="20"/>
+                <w:szCs w:val="20"/>
+              </w:rPr>
+              <w:t xml:space="preserve"/>
+            </w:r>
+          </w:p>
+        </w:tc>
+        <w:tc>
+          <w:tcPr>
+            <w:tcW w:type="dxa" w:w="793"/>
+            <w:tcBorders>
+              <w:top w:val="single" w:color="000000" w:sz="4"/>
+              <w:left w:val="single" w:color="000000" w:sz="4"/>
+              <w:bottom w:val="single" w:color="000000" w:sz="4"/>
+              <w:right w:val="single" w:color="000000" w:sz="4"/>
+            </w:tcBorders>
+            <w:shd w:fill="ffffff" w:color="auto" w:val="clear"/>
+            <w:tcMar>
+              <w:top w:type="dxa" w:w="170"/>
+              <w:left w:type="dxa" w:w="170"/>
+              <w:bottom w:type="dxa" w:w="170"/>
+              <w:right w:type="dxa" w:w="170"/>
+            </w:tcMar>
+            <w:vAlign w:val="center"/>
+          </w:tcPr>
+          <w:p>
+            <w:pPr>
+              <w:jc w:val="left"/>
+            </w:pPr>
+            <w:r>
+              <w:rPr>
+                <w:rFonts w:ascii="NanumGothic" w:cs="NanumGothic" w:eastAsia="NanumGothic" w:hAnsi="NanumGothic"/>
+                <w:sz w:val="20"/>
+                <w:szCs w:val="20"/>
+              </w:rPr>
+              <w:t xml:space="preserve"/>
+            </w:r>
+          </w:p>
+        </w:tc>
+        <w:tc>
+          <w:tcPr>
+            <w:tcW w:type="dxa" w:w="1247"/>
+            <w:tcBorders>
+              <w:top w:val="single" w:color="000000" w:sz="4"/>
+              <w:left w:val="single" w:color="000000" w:sz="4"/>
+              <w:bottom w:val="single" w:color="000000" w:sz="4"/>
+              <w:right w:val="single" w:color="000000" w:sz="4"/>
+            </w:tcBorders>
+            <w:shd w:fill="ffffff" w:color="auto" w:val="clear"/>
+            <w:tcMar>
+              <w:top w:type="dxa" w:w="170"/>
+              <w:left w:type="dxa" w:w="170"/>
+              <w:bottom w:type="dxa" w:w="170"/>
+              <w:right w:type="dxa" w:w="170"/>
+            </w:tcMar>
+            <w:vAlign w:val="center"/>
+          </w:tcPr>
+          <w:p>
+            <w:pPr>
+              <w:jc w:val="left"/>
+            </w:pPr>
+            <w:r>
+              <w:rPr>
+                <w:rFonts w:ascii="NanumGothic" w:cs="NanumGothic" w:eastAsia="NanumGothic" w:hAnsi="NanumGothic"/>
+                <w:sz w:val="20"/>
+                <w:szCs w:val="20"/>
+              </w:rPr>
+              <w:t xml:space="preserve"/>
+            </w:r>
+          </w:p>
+        </w:tc>
+        <w:tc>
+          <w:tcPr>
+            <w:tcW w:type="dxa" w:w="1247"/>
+            <w:tcBorders>
+              <w:top w:val="single" w:color="000000" w:sz="4"/>
+              <w:left w:val="single" w:color="000000" w:sz="4"/>
+              <w:bottom w:val="single" w:color="000000" w:sz="4"/>
+              <w:right w:val="single" w:color="000000" w:sz="4"/>
+            </w:tcBorders>
+            <w:shd w:fill="ffffff" w:color="auto" w:val="clear"/>
+            <w:tcMar>
+              <w:top w:type="dxa" w:w="170"/>
+              <w:left w:type="dxa" w:w="170"/>
+              <w:bottom w:type="dxa" w:w="170"/>
+              <w:right w:type="dxa" w:w="170"/>
+            </w:tcMar>
+            <w:vAlign w:val="center"/>
+          </w:tcPr>
+          <w:p>
+            <w:pPr>
+              <w:jc w:val="left"/>
+            </w:pPr>
+            <w:r>
+              <w:rPr>
+                <w:rFonts w:ascii="NanumGothic" w:cs="NanumGothic" w:eastAsia="NanumGothic" w:hAnsi="NanumGothic"/>
+                <w:sz w:val="20"/>
+                <w:szCs w:val="20"/>
+              </w:rPr>
+              <w:t xml:space="preserve"/>
+            </w:r>
+          </w:p>
+        </w:tc>
+        <w:tc>
+          <w:tcPr>
+            <w:tcW w:type="dxa" w:w="1133"/>
+            <w:tcBorders>
+              <w:top w:val="single" w:color="000000" w:sz="4"/>
+              <w:left w:val="single" w:color="000000" w:sz="4"/>
+              <w:bottom w:val="single" w:color="000000" w:sz="4"/>
+              <w:right w:val="single" w:color="000000" w:sz="4"/>
+            </w:tcBorders>
+            <w:shd w:fill="ffffff" w:color="auto" w:val="clear"/>
+            <w:tcMar>
+              <w:top w:type="dxa" w:w="170"/>
+              <w:left w:type="dxa" w:w="170"/>
+              <w:bottom w:type="dxa" w:w="170"/>
+              <w:right w:type="dxa" w:w="170"/>
+            </w:tcMar>
+            <w:vAlign w:val="center"/>
+          </w:tcPr>
+          <w:p>
+            <w:pPr>
+              <w:jc w:val="left"/>
+            </w:pPr>
+            <w:r>
+              <w:rPr>
+                <w:rFonts w:ascii="NanumGothic" w:cs="NanumGothic" w:eastAsia="NanumGothic" w:hAnsi="NanumGothic"/>
+                <w:sz w:val="20"/>
+                <w:szCs w:val="20"/>
+              </w:rPr>
+              <w:t xml:space="preserve"/>
+            </w:r>
+          </w:p>
+        </w:tc>
+        <w:tc>
+          <w:tcPr>
+            <w:tcW w:type="dxa" w:w="1814"/>
+            <w:tcBorders>
+              <w:top w:val="single" w:color="000000" w:sz="4"/>
+              <w:left w:val="single" w:color="000000" w:sz="4"/>
+              <w:bottom w:val="single" w:color="000000" w:sz="4"/>
+              <w:right w:val="single" w:color="000000" w:sz="4"/>
+            </w:tcBorders>
+            <w:shd w:fill="ffffff" w:color="auto" w:val="clear"/>
+            <w:tcMar>
+              <w:top w:type="dxa" w:w="170"/>
+              <w:left w:type="dxa" w:w="170"/>
+              <w:bottom w:type="dxa" w:w="170"/>
+              <w:right w:type="dxa" w:w="170"/>
+            </w:tcMar>
+            <w:vAlign w:val="center"/>
+          </w:tcPr>
+          <w:p>
+            <w:pPr>
+              <w:jc w:val="left"/>
+            </w:pPr>
+            <w:r>
+              <w:rPr>
+                <w:rFonts w:ascii="NanumGothic" w:cs="NanumGothic" w:eastAsia="NanumGothic" w:hAnsi="NanumGothic"/>
+                <w:sz w:val="20"/>
+                <w:szCs w:val="20"/>
+              </w:rPr>
+              <w:t xml:space="preserve"/>
+            </w:r>
+          </w:p>
+        </w:tc>
+        <w:tc>
+          <w:tcPr>
+            <w:tcW w:type="dxa" w:w="1814"/>
+            <w:tcBorders>
+              <w:top w:val="single" w:color="000000" w:sz="4"/>
+              <w:left w:val="single" w:color="000000" w:sz="4"/>
+              <w:bottom w:val="single" w:color="000000" w:sz="4"/>
+              <w:right w:val="single" w:color="000000" w:sz="4"/>
+            </w:tcBorders>
+            <w:shd w:fill="ffffff" w:color="auto" w:val="clear"/>
+            <w:tcMar>
+              <w:top w:type="dxa" w:w="170"/>
+              <w:left w:type="dxa" w:w="170"/>
+              <w:bottom w:type="dxa" w:w="170"/>
+              <w:right w:type="dxa" w:w="170"/>
+            </w:tcMar>
+            <w:vAlign w:val="center"/>
+          </w:tcPr>
+          <w:p>
+            <w:pPr>
+              <w:jc w:val="left"/>
+            </w:pPr>
+            <w:r>
+              <w:rPr>
+                <w:rFonts w:ascii="NanumGothic" w:cs="NanumGothic" w:eastAsia="NanumGothic" w:hAnsi="NanumGothic"/>
+                <w:sz w:val="20"/>
+                <w:szCs w:val="20"/>
+              </w:rPr>
+              <w:t xml:space="preserve"/>
+            </w:r>
+          </w:p>
+        </w:tc>
+        <w:tc>
+          <w:tcPr>
+            <w:tcW w:type="dxa" w:w="1077"/>
             <w:tcBorders>
               <w:top w:val="single" w:color="000000" w:sz="4"/>
               <w:left w:val="single" w:color="000000" w:sz="4"/>
@@ -2622,7 +3140,7 @@
         </w:trPr>
         <w:tc>
           <w:tcPr>
-            <w:tcW w:type="dxa" w:w="2154"/>
+            <w:tcW w:type="dxa" w:w="1700"/>
             <w:tcBorders>
               <w:top w:val="single" w:color="000000" w:sz="4"/>
               <w:left w:val="single" w:color="000000" w:sz="4"/>
@@ -2654,7 +3172,7 @@
         </w:tc>
         <w:tc>
           <w:tcPr>
-            <w:tcW w:type="dxa" w:w="1587"/>
+            <w:tcW w:type="dxa" w:w="1133"/>
             <w:tcBorders>
               <w:top w:val="single" w:color="000000" w:sz="4"/>
               <w:left w:val="single" w:color="000000" w:sz="4"/>
@@ -2686,7 +3204,7 @@
         </w:tc>
         <w:tc>
           <w:tcPr>
-            <w:tcW w:type="dxa" w:w="907"/>
+            <w:tcW w:type="dxa" w:w="1360"/>
             <w:tcBorders>
               <w:top w:val="single" w:color="000000" w:sz="4"/>
               <w:left w:val="single" w:color="000000" w:sz="4"/>
@@ -2718,7 +3236,7 @@
         </w:tc>
         <w:tc>
           <w:tcPr>
-            <w:tcW w:type="dxa" w:w="1360"/>
+            <w:tcW w:type="dxa" w:w="1247"/>
             <w:tcBorders>
               <w:top w:val="single" w:color="000000" w:sz="4"/>
               <w:left w:val="single" w:color="000000" w:sz="4"/>
@@ -2750,7 +3268,7 @@
         </w:tc>
         <w:tc>
           <w:tcPr>
-            <w:tcW w:type="dxa" w:w="1360"/>
+            <w:tcW w:type="dxa" w:w="793"/>
             <w:tcBorders>
               <w:top w:val="single" w:color="000000" w:sz="4"/>
               <w:left w:val="single" w:color="000000" w:sz="4"/>
@@ -2782,7 +3300,7 @@
         </w:tc>
         <w:tc>
           <w:tcPr>
-            <w:tcW w:type="dxa" w:w="1360"/>
+            <w:tcW w:type="dxa" w:w="1247"/>
             <w:tcBorders>
               <w:top w:val="single" w:color="000000" w:sz="4"/>
               <w:left w:val="single" w:color="000000" w:sz="4"/>
@@ -2814,7 +3332,7 @@
         </w:tc>
         <w:tc>
           <w:tcPr>
-            <w:tcW w:type="dxa" w:w="2267"/>
+            <w:tcW w:type="dxa" w:w="1247"/>
             <w:tcBorders>
               <w:top w:val="single" w:color="000000" w:sz="4"/>
               <w:left w:val="single" w:color="000000" w:sz="4"/>
@@ -2846,7 +3364,7 @@
         </w:tc>
         <w:tc>
           <w:tcPr>
-            <w:tcW w:type="dxa" w:w="2267"/>
+            <w:tcW w:type="dxa" w:w="1133"/>
             <w:tcBorders>
               <w:top w:val="single" w:color="000000" w:sz="4"/>
               <w:left w:val="single" w:color="000000" w:sz="4"/>
@@ -2878,7 +3396,7 @@
         </w:tc>
         <w:tc>
           <w:tcPr>
-            <w:tcW w:type="dxa" w:w="1303"/>
+            <w:tcW w:type="dxa" w:w="1814"/>
             <w:tcBorders>
               <w:top w:val="single" w:color="000000" w:sz="4"/>
               <w:left w:val="single" w:color="000000" w:sz="4"/>
@@ -2904,6 +3422,219 @@
                 <w:sz w:val="20"/>
                 <w:szCs w:val="20"/>
               </w:rPr>
+              <w:t xml:space="preserve"/>
+            </w:r>
+          </w:p>
+        </w:tc>
+        <w:tc>
+          <w:tcPr>
+            <w:tcW w:type="dxa" w:w="1814"/>
+            <w:tcBorders>
+              <w:top w:val="single" w:color="000000" w:sz="4"/>
+              <w:left w:val="single" w:color="000000" w:sz="4"/>
+              <w:bottom w:val="single" w:color="000000" w:sz="4"/>
+              <w:right w:val="single" w:color="000000" w:sz="4"/>
+            </w:tcBorders>
+            <w:shd w:fill="F5F5F5" w:color="auto" w:val="clear"/>
+            <w:tcMar>
+              <w:top w:type="dxa" w:w="170"/>
+              <w:left w:type="dxa" w:w="170"/>
+              <w:bottom w:type="dxa" w:w="170"/>
+              <w:right w:type="dxa" w:w="170"/>
+            </w:tcMar>
+            <w:vAlign w:val="center"/>
+          </w:tcPr>
+          <w:p>
+            <w:pPr>
+              <w:jc w:val="left"/>
+            </w:pPr>
+            <w:r>
+              <w:rPr>
+                <w:rFonts w:ascii="NanumGothic" w:cs="NanumGothic" w:eastAsia="NanumGothic" w:hAnsi="NanumGothic"/>
+                <w:sz w:val="20"/>
+                <w:szCs w:val="20"/>
+              </w:rPr>
+              <w:t xml:space="preserve"/>
+            </w:r>
+          </w:p>
+        </w:tc>
+        <w:tc>
+          <w:tcPr>
+            <w:tcW w:type="dxa" w:w="1077"/>
+            <w:tcBorders>
+              <w:top w:val="single" w:color="000000" w:sz="4"/>
+              <w:left w:val="single" w:color="000000" w:sz="4"/>
+              <w:bottom w:val="single" w:color="000000" w:sz="4"/>
+              <w:right w:val="single" w:color="000000" w:sz="4"/>
+            </w:tcBorders>
+            <w:shd w:fill="F5F5F5" w:color="auto" w:val="clear"/>
+            <w:tcMar>
+              <w:top w:type="dxa" w:w="170"/>
+              <w:left w:type="dxa" w:w="170"/>
+              <w:bottom w:type="dxa" w:w="170"/>
+              <w:right w:type="dxa" w:w="170"/>
+            </w:tcMar>
+            <w:vAlign w:val="center"/>
+          </w:tcPr>
+          <w:p>
+            <w:pPr>
+              <w:jc w:val="left"/>
+            </w:pPr>
+            <w:r>
+              <w:rPr>
+                <w:rFonts w:ascii="NanumGothic" w:cs="NanumGothic" w:eastAsia="NanumGothic" w:hAnsi="NanumGothic"/>
+                <w:sz w:val="20"/>
+                <w:szCs w:val="20"/>
+              </w:rPr>
+              <w:t xml:space="preserve"/>
+            </w:r>
+          </w:p>
+        </w:tc>
+      </w:tr>
+    </w:tbl>
+    <w:p>
+      <w:pPr>
+        <w:spacing w:after="80" w:before="80"/>
+      </w:pPr>
+      <w:r>
+        <w:t xml:space="preserve"/>
+      </w:r>
+    </w:p>
+    <w:tbl>
+      <w:tblPr>
+        <w:tblW w:type="dxa" w:w="14570"/>
+        <w:jc w:val="right"/>
+        <w:tblBorders>
+          <w:top w:val="single" w:color="auto" w:sz="4"/>
+          <w:left w:val="single" w:color="auto" w:sz="4"/>
+          <w:bottom w:val="single" w:color="auto" w:sz="4"/>
+          <w:right w:val="single" w:color="auto" w:sz="4"/>
+          <w:insideH w:val="single" w:color="auto" w:sz="4"/>
+          <w:insideV w:val="single" w:color="auto" w:sz="4"/>
+        </w:tblBorders>
+        <w:tblLayout w:type="fixed"/>
+      </w:tblPr>
+      <w:tblGrid>
+        <w:gridCol w:w="7285"/>
+        <w:gridCol w:w="7285"/>
+      </w:tblGrid>
+      <w:tr>
+        <w:trPr>
+          <w:trHeight w:val="396" w:hRule="atLeast"/>
+        </w:trPr>
+        <w:tc>
+          <w:tcPr>
+            <w:tcW w:type="dxa" w:w="7285"/>
+            <w:tcBorders>
+              <w:top w:val="single" w:color="000000" w:sz="6"/>
+              <w:left w:val="single" w:color="000000" w:sz="6"/>
+              <w:bottom w:val="single" w:color="000000" w:sz="6"/>
+              <w:right w:val="single" w:color="000000" w:sz="6"/>
+            </w:tcBorders>
+            <w:shd w:fill="E8E8E8" w:color="auto" w:val="clear"/>
+            <w:tcMar>
+              <w:top w:type="dxa" w:w="170"/>
+              <w:left w:type="dxa" w:w="170"/>
+              <w:bottom w:type="dxa" w:w="170"/>
+              <w:right w:type="dxa" w:w="170"/>
+            </w:tcMar>
+            <w:vAlign w:val="center"/>
+          </w:tcPr>
+          <w:p>
+            <w:pPr>
+              <w:jc w:val="center"/>
+            </w:pPr>
+            <w:r>
+              <w:rPr>
+                <w:rFonts w:ascii="NanumGothic" w:cs="NanumGothic" w:eastAsia="NanumGothic" w:hAnsi="NanumGothic"/>
+                <w:b/>
+                <w:bCs/>
+                <w:sz w:val="20"/>
+                <w:szCs w:val="20"/>
+              </w:rPr>
+              <w:t xml:space="preserve">실사책임자</w:t>
+            </w:r>
+          </w:p>
+        </w:tc>
+        <w:tc>
+          <w:tcPr>
+            <w:tcW w:type="dxa" w:w="7285"/>
+            <w:tcBorders>
+              <w:top w:val="single" w:color="000000" w:sz="6"/>
+              <w:left w:val="single" w:color="000000" w:sz="6"/>
+              <w:bottom w:val="single" w:color="000000" w:sz="6"/>
+              <w:right w:val="single" w:color="000000" w:sz="6"/>
+            </w:tcBorders>
+            <w:shd w:fill="E8E8E8" w:color="auto" w:val="clear"/>
+            <w:tcMar>
+              <w:top w:type="dxa" w:w="170"/>
+              <w:left w:type="dxa" w:w="170"/>
+              <w:bottom w:type="dxa" w:w="170"/>
+              <w:right w:type="dxa" w:w="170"/>
+            </w:tcMar>
+            <w:vAlign w:val="center"/>
+          </w:tcPr>
+          <w:p>
+            <w:pPr>
+              <w:jc w:val="center"/>
+            </w:pPr>
+            <w:r>
+              <w:rPr>
+                <w:rFonts w:ascii="NanumGothic" w:cs="NanumGothic" w:eastAsia="NanumGothic" w:hAnsi="NanumGothic"/>
+                <w:b/>
+                <w:bCs/>
+                <w:sz w:val="20"/>
+                <w:szCs w:val="20"/>
+              </w:rPr>
+              <w:t xml:space="preserve">차이처리 승인자</w:t>
+            </w:r>
+          </w:p>
+        </w:tc>
+      </w:tr>
+      <w:tr>
+        <w:trPr>
+          <w:trHeight w:val="850" w:hRule="atLeast"/>
+        </w:trPr>
+        <w:tc>
+          <w:tcPr>
+            <w:tcW w:type="dxa" w:w="7285"/>
+            <w:tcBorders>
+              <w:top w:val="single" w:color="000000" w:sz="6"/>
+              <w:left w:val="single" w:color="000000" w:sz="6"/>
+              <w:bottom w:val="single" w:color="000000" w:sz="6"/>
+              <w:right w:val="single" w:color="000000" w:sz="6"/>
+            </w:tcBorders>
+            <w:tcMar>
+              <w:top w:type="dxa" w:w="170"/>
+              <w:left w:type="dxa" w:w="170"/>
+              <w:bottom w:type="dxa" w:w="170"/>
+              <w:right w:type="dxa" w:w="170"/>
+            </w:tcMar>
+          </w:tcPr>
+          <w:p>
+            <w:r>
+              <w:t xml:space="preserve"/>
+            </w:r>
+          </w:p>
+        </w:tc>
+        <w:tc>
+          <w:tcPr>
+            <w:tcW w:type="dxa" w:w="7285"/>
+            <w:tcBorders>
+              <w:top w:val="single" w:color="000000" w:sz="6"/>
+              <w:left w:val="single" w:color="000000" w:sz="6"/>
+              <w:bottom w:val="single" w:color="000000" w:sz="6"/>
+              <w:right w:val="single" w:color="000000" w:sz="6"/>
+            </w:tcBorders>
+            <w:tcMar>
+              <w:top w:type="dxa" w:w="170"/>
+              <w:left w:type="dxa" w:w="170"/>
+              <w:bottom w:type="dxa" w:w="170"/>
+              <w:right w:type="dxa" w:w="170"/>
+            </w:tcMar>
+          </w:tcPr>
+          <w:p>
+            <w:r>
               <w:t xml:space="preserve"/>
             </w:r>
           </w:p>

</xml_diff>